<commit_message>
se agrego el modelo SOLO PECO
</commit_message>
<xml_diff>
--- a/interfaz3/semiPlantillaFinalInformeV2NUEVO.docx
+++ b/interfaz3/semiPlantillaFinalInformeV2NUEVO.docx
@@ -947,21 +947,6 @@
           <w:shd w:val="clear" w:color="auto" w:fill="FAF9F8"/>
         </w:rPr>
       </w:pPr>
-    </w:p>
-    <w:p>
-      <w:pPr>
-        <w:autoSpaceDE w:val="0"/>
-        <w:autoSpaceDN w:val="0"/>
-        <w:adjustRightInd w:val="0"/>
-        <w:spacing w:after="0" w:line="240" w:lineRule="auto"/>
-        <w:jc w:val="both"/>
-        <w:rPr>
-          <w:rFonts w:ascii="Arial" w:hAnsi="Arial" w:cs="Arial"/>
-          <w:sz w:val="22"/>
-          <w:szCs w:val="22"/>
-          <w:shd w:val="clear" w:color="auto" w:fill="FAF9F8"/>
-        </w:rPr>
-      </w:pPr>
       <w:r>
         <w:rPr>
           <w:rFonts w:ascii="Arial" w:hAnsi="Arial" w:cs="Arial"/>
@@ -1518,6 +1503,34 @@
           <w:shd w:val="clear" w:color="auto" w:fill="FAF9F8"/>
         </w:rPr>
       </w:pPr>
+      <w:r>
+        <w:rPr>
+          <w:rFonts w:ascii="Arial" w:hAnsi="Arial" w:cs="Arial"/>
+          <w:sz w:val="22"/>
+          <w:szCs w:val="22"/>
+          <w:shd w:val="clear" w:color="auto" w:fill="FAF9F8"/>
+        </w:rPr>
+        <w:t>{/</w:t>
+      </w:r>
+      <w:proofErr w:type="spellStart"/>
+      <w:r>
+        <w:rPr>
+          <w:rFonts w:ascii="Arial" w:hAnsi="Arial" w:cs="Arial"/>
+          <w:sz w:val="22"/>
+          <w:szCs w:val="22"/>
+        </w:rPr>
+        <w:t>estadoPECOyAMAZONIA</w:t>
+      </w:r>
+      <w:proofErr w:type="spellEnd"/>
+      <w:r>
+        <w:rPr>
+          <w:rFonts w:ascii="Arial" w:hAnsi="Arial" w:cs="Arial"/>
+          <w:sz w:val="22"/>
+          <w:szCs w:val="22"/>
+          <w:shd w:val="clear" w:color="auto" w:fill="FAF9F8"/>
+        </w:rPr>
+        <w:t>}</w:t>
+      </w:r>
     </w:p>
     <w:p>
       <w:pPr>
@@ -1540,6 +1553,398 @@
           <w:szCs w:val="22"/>
           <w:shd w:val="clear" w:color="auto" w:fill="FAF9F8"/>
         </w:rPr>
+        <w:t>{#</w:t>
+      </w:r>
+      <w:r>
+        <w:rPr>
+          <w:rFonts w:ascii="Arial" w:hAnsi="Arial" w:cs="Arial"/>
+          <w:sz w:val="22"/>
+          <w:szCs w:val="22"/>
+          <w:shd w:val="clear" w:color="auto" w:fill="FAF9F8"/>
+        </w:rPr>
+        <w:t>estadoOnlyPECO</w:t>
+      </w:r>
+      <w:r>
+        <w:rPr>
+          <w:rFonts w:ascii="Arial" w:hAnsi="Arial" w:cs="Arial"/>
+          <w:sz w:val="22"/>
+          <w:szCs w:val="22"/>
+          <w:shd w:val="clear" w:color="auto" w:fill="FAF9F8"/>
+        </w:rPr>
+        <w:t>}</w:t>
+      </w:r>
+    </w:p>
+    <w:p>
+      <w:pPr>
+        <w:numPr>
+          <w:ilvl w:val="1"/>
+          <w:numId w:val="21"/>
+        </w:numPr>
+        <w:autoSpaceDE w:val="0"/>
+        <w:autoSpaceDN w:val="0"/>
+        <w:adjustRightInd w:val="0"/>
+        <w:spacing w:after="0" w:line="240" w:lineRule="auto"/>
+        <w:ind w:left="426"/>
+        <w:jc w:val="both"/>
+        <w:rPr>
+          <w:rFonts w:ascii="Arial" w:hAnsi="Arial" w:cs="Arial"/>
+          <w:sz w:val="22"/>
+          <w:szCs w:val="22"/>
+          <w:shd w:val="clear" w:color="auto" w:fill="FAF9F8"/>
+        </w:rPr>
+      </w:pPr>
+      <w:r>
+        <w:rPr>
+          <w:rFonts w:ascii="Arial" w:hAnsi="Arial" w:cs="Arial"/>
+          <w:sz w:val="22"/>
+          <w:szCs w:val="22"/>
+          <w:shd w:val="clear" w:color="auto" w:fill="FAF9F8"/>
+        </w:rPr>
+        <w:t xml:space="preserve">Ley General de Aduanas, Decreto Legislativo </w:t>
+      </w:r>
+      <w:proofErr w:type="spellStart"/>
+      <w:r>
+        <w:rPr>
+          <w:rFonts w:ascii="Arial" w:hAnsi="Arial" w:cs="Arial"/>
+          <w:sz w:val="22"/>
+          <w:szCs w:val="22"/>
+          <w:shd w:val="clear" w:color="auto" w:fill="FAF9F8"/>
+        </w:rPr>
+        <w:t>N°</w:t>
+      </w:r>
+      <w:proofErr w:type="spellEnd"/>
+      <w:r>
+        <w:rPr>
+          <w:rFonts w:ascii="Arial" w:hAnsi="Arial" w:cs="Arial"/>
+          <w:sz w:val="22"/>
+          <w:szCs w:val="22"/>
+          <w:shd w:val="clear" w:color="auto" w:fill="FAF9F8"/>
+        </w:rPr>
+        <w:t xml:space="preserve"> 1053, publicado el 27.6.2008, y modificatorias.</w:t>
+      </w:r>
+    </w:p>
+    <w:p>
+      <w:pPr>
+        <w:numPr>
+          <w:ilvl w:val="1"/>
+          <w:numId w:val="21"/>
+        </w:numPr>
+        <w:autoSpaceDE w:val="0"/>
+        <w:autoSpaceDN w:val="0"/>
+        <w:adjustRightInd w:val="0"/>
+        <w:spacing w:after="0" w:line="240" w:lineRule="auto"/>
+        <w:ind w:left="426"/>
+        <w:jc w:val="both"/>
+        <w:rPr>
+          <w:rFonts w:ascii="Arial" w:hAnsi="Arial" w:cs="Arial"/>
+          <w:sz w:val="22"/>
+          <w:szCs w:val="22"/>
+          <w:shd w:val="clear" w:color="auto" w:fill="FAF9F8"/>
+        </w:rPr>
+      </w:pPr>
+      <w:r>
+        <w:rPr>
+          <w:rFonts w:ascii="Arial" w:hAnsi="Arial" w:cs="Arial"/>
+          <w:sz w:val="22"/>
+          <w:szCs w:val="22"/>
+          <w:shd w:val="clear" w:color="auto" w:fill="FAF9F8"/>
+        </w:rPr>
+        <w:t>Convenio</w:t>
+      </w:r>
+      <w:r>
+        <w:rPr>
+          <w:rFonts w:ascii="Arial" w:hAnsi="Arial" w:cs="Arial"/>
+          <w:sz w:val="22"/>
+          <w:szCs w:val="22"/>
+          <w:shd w:val="clear" w:color="auto" w:fill="FAF9F8"/>
+        </w:rPr>
+        <w:t xml:space="preserve"> </w:t>
+      </w:r>
+      <w:r>
+        <w:rPr>
+          <w:rFonts w:ascii="Arial" w:hAnsi="Arial" w:cs="Arial"/>
+          <w:sz w:val="22"/>
+          <w:szCs w:val="22"/>
+          <w:shd w:val="clear" w:color="auto" w:fill="FAF9F8"/>
+        </w:rPr>
+        <w:t>de Cooperación Aduanera Peruano-</w:t>
+      </w:r>
+      <w:proofErr w:type="gramStart"/>
+      <w:r>
+        <w:rPr>
+          <w:rFonts w:ascii="Arial" w:hAnsi="Arial" w:cs="Arial"/>
+          <w:sz w:val="22"/>
+          <w:szCs w:val="22"/>
+          <w:shd w:val="clear" w:color="auto" w:fill="FAF9F8"/>
+        </w:rPr>
+        <w:t>Colombiano</w:t>
+      </w:r>
+      <w:proofErr w:type="gramEnd"/>
+      <w:r>
+        <w:rPr>
+          <w:rFonts w:ascii="Arial" w:hAnsi="Arial" w:cs="Arial"/>
+          <w:sz w:val="22"/>
+          <w:szCs w:val="22"/>
+          <w:shd w:val="clear" w:color="auto" w:fill="FAF9F8"/>
+        </w:rPr>
+        <w:t xml:space="preserve"> de 1938 y su Protocolo Modificatorio, aprobado por Resolución Legislativa </w:t>
+      </w:r>
+      <w:proofErr w:type="spellStart"/>
+      <w:r>
+        <w:rPr>
+          <w:rFonts w:ascii="Arial" w:hAnsi="Arial" w:cs="Arial"/>
+          <w:sz w:val="22"/>
+          <w:szCs w:val="22"/>
+          <w:shd w:val="clear" w:color="auto" w:fill="FAF9F8"/>
+        </w:rPr>
+        <w:t>N.°</w:t>
+      </w:r>
+      <w:proofErr w:type="spellEnd"/>
+      <w:r>
+        <w:rPr>
+          <w:rFonts w:ascii="Arial" w:hAnsi="Arial" w:cs="Arial"/>
+          <w:sz w:val="22"/>
+          <w:szCs w:val="22"/>
+          <w:shd w:val="clear" w:color="auto" w:fill="FAF9F8"/>
+        </w:rPr>
+        <w:t xml:space="preserve"> 23254, publicada el 22.05.1981</w:t>
+      </w:r>
+      <w:r>
+        <w:rPr>
+          <w:rFonts w:ascii="Arial" w:hAnsi="Arial" w:cs="Arial"/>
+          <w:sz w:val="22"/>
+          <w:szCs w:val="22"/>
+          <w:shd w:val="clear" w:color="auto" w:fill="FAF9F8"/>
+        </w:rPr>
+        <w:t>.</w:t>
+      </w:r>
+    </w:p>
+    <w:p>
+      <w:pPr>
+        <w:numPr>
+          <w:ilvl w:val="1"/>
+          <w:numId w:val="21"/>
+        </w:numPr>
+        <w:autoSpaceDE w:val="0"/>
+        <w:autoSpaceDN w:val="0"/>
+        <w:adjustRightInd w:val="0"/>
+        <w:spacing w:after="0" w:line="240" w:lineRule="auto"/>
+        <w:ind w:left="426"/>
+        <w:jc w:val="both"/>
+        <w:rPr>
+          <w:rFonts w:ascii="Arial" w:hAnsi="Arial" w:cs="Arial"/>
+          <w:sz w:val="22"/>
+          <w:szCs w:val="22"/>
+          <w:shd w:val="clear" w:color="auto" w:fill="FAF9F8"/>
+        </w:rPr>
+      </w:pPr>
+      <w:r>
+        <w:rPr>
+          <w:rFonts w:ascii="Arial" w:hAnsi="Arial" w:cs="Arial"/>
+          <w:sz w:val="22"/>
+          <w:szCs w:val="22"/>
+          <w:shd w:val="clear" w:color="auto" w:fill="FAF9F8"/>
+        </w:rPr>
+        <w:t>Medidas</w:t>
+      </w:r>
+      <w:r>
+        <w:rPr>
+          <w:rFonts w:ascii="Arial" w:hAnsi="Arial" w:cs="Arial"/>
+          <w:sz w:val="22"/>
+          <w:szCs w:val="22"/>
+          <w:shd w:val="clear" w:color="auto" w:fill="FAF9F8"/>
+        </w:rPr>
+        <w:t xml:space="preserve"> </w:t>
+      </w:r>
+      <w:r>
+        <w:rPr>
+          <w:rFonts w:ascii="Arial" w:hAnsi="Arial" w:cs="Arial"/>
+          <w:sz w:val="22"/>
+          <w:szCs w:val="22"/>
+          <w:shd w:val="clear" w:color="auto" w:fill="FAF9F8"/>
+        </w:rPr>
+        <w:t xml:space="preserve">a fin de garantizar el cumplimiento de las obligaciones asumidas por nuestro país en el Convenio de Cooperación Aduanera con Colombia, dictada por Decreto Supremo </w:t>
+      </w:r>
+      <w:proofErr w:type="spellStart"/>
+      <w:r>
+        <w:rPr>
+          <w:rFonts w:ascii="Arial" w:hAnsi="Arial" w:cs="Arial"/>
+          <w:sz w:val="22"/>
+          <w:szCs w:val="22"/>
+          <w:shd w:val="clear" w:color="auto" w:fill="FAF9F8"/>
+        </w:rPr>
+        <w:t>N.°</w:t>
+      </w:r>
+      <w:proofErr w:type="spellEnd"/>
+      <w:r>
+        <w:rPr>
+          <w:rFonts w:ascii="Arial" w:hAnsi="Arial" w:cs="Arial"/>
+          <w:sz w:val="22"/>
+          <w:szCs w:val="22"/>
+          <w:shd w:val="clear" w:color="auto" w:fill="FAF9F8"/>
+        </w:rPr>
+        <w:t xml:space="preserve"> 15-94-EF, publicado el 09.02.1994, y modificatorias.</w:t>
+      </w:r>
+    </w:p>
+    <w:p>
+      <w:pPr>
+        <w:numPr>
+          <w:ilvl w:val="1"/>
+          <w:numId w:val="21"/>
+        </w:numPr>
+        <w:autoSpaceDE w:val="0"/>
+        <w:autoSpaceDN w:val="0"/>
+        <w:adjustRightInd w:val="0"/>
+        <w:spacing w:after="0" w:line="240" w:lineRule="auto"/>
+        <w:ind w:left="426"/>
+        <w:jc w:val="both"/>
+        <w:rPr>
+          <w:rFonts w:ascii="Arial" w:hAnsi="Arial" w:cs="Arial"/>
+          <w:sz w:val="22"/>
+          <w:szCs w:val="22"/>
+          <w:shd w:val="clear" w:color="auto" w:fill="FAF9F8"/>
+        </w:rPr>
+      </w:pPr>
+      <w:r>
+        <w:rPr>
+          <w:rFonts w:ascii="Arial" w:hAnsi="Arial" w:cs="Arial"/>
+          <w:sz w:val="22"/>
+          <w:szCs w:val="22"/>
+          <w:shd w:val="clear" w:color="auto" w:fill="FAF9F8"/>
+        </w:rPr>
+        <w:t xml:space="preserve">Arancel </w:t>
+      </w:r>
+      <w:r>
+        <w:rPr>
+          <w:rFonts w:ascii="Arial" w:hAnsi="Arial" w:cs="Arial"/>
+          <w:sz w:val="22"/>
+          <w:szCs w:val="22"/>
+          <w:shd w:val="clear" w:color="auto" w:fill="FAF9F8"/>
+        </w:rPr>
+        <w:t>Común Anexo al Protocolo Modificatorio del Convenio de Cooperación Aduanera Peruano-</w:t>
+      </w:r>
+      <w:proofErr w:type="gramStart"/>
+      <w:r>
+        <w:rPr>
+          <w:rFonts w:ascii="Arial" w:hAnsi="Arial" w:cs="Arial"/>
+          <w:sz w:val="22"/>
+          <w:szCs w:val="22"/>
+          <w:shd w:val="clear" w:color="auto" w:fill="FAF9F8"/>
+        </w:rPr>
+        <w:t>Colombiano</w:t>
+      </w:r>
+      <w:proofErr w:type="gramEnd"/>
+      <w:r>
+        <w:rPr>
+          <w:rFonts w:ascii="Arial" w:hAnsi="Arial" w:cs="Arial"/>
+          <w:sz w:val="22"/>
+          <w:szCs w:val="22"/>
+          <w:shd w:val="clear" w:color="auto" w:fill="FAF9F8"/>
+        </w:rPr>
+        <w:t xml:space="preserve"> de 1938, puesto en vigencia por el Decreto Supremo </w:t>
+      </w:r>
+      <w:proofErr w:type="spellStart"/>
+      <w:r>
+        <w:rPr>
+          <w:rFonts w:ascii="Arial" w:hAnsi="Arial" w:cs="Arial"/>
+          <w:sz w:val="22"/>
+          <w:szCs w:val="22"/>
+          <w:shd w:val="clear" w:color="auto" w:fill="FAF9F8"/>
+        </w:rPr>
+        <w:t>N°</w:t>
+      </w:r>
+      <w:proofErr w:type="spellEnd"/>
+      <w:r>
+        <w:rPr>
+          <w:rFonts w:ascii="Arial" w:hAnsi="Arial" w:cs="Arial"/>
+          <w:sz w:val="22"/>
+          <w:szCs w:val="22"/>
+          <w:shd w:val="clear" w:color="auto" w:fill="FAF9F8"/>
+        </w:rPr>
+        <w:t xml:space="preserve"> 069-82-EFC, publicado el 04.03.1982, y modificatorias</w:t>
+      </w:r>
+    </w:p>
+    <w:p>
+      <w:pPr>
+        <w:numPr>
+          <w:ilvl w:val="1"/>
+          <w:numId w:val="21"/>
+        </w:numPr>
+        <w:autoSpaceDE w:val="0"/>
+        <w:autoSpaceDN w:val="0"/>
+        <w:adjustRightInd w:val="0"/>
+        <w:spacing w:after="0" w:line="240" w:lineRule="auto"/>
+        <w:ind w:left="426"/>
+        <w:jc w:val="both"/>
+        <w:rPr>
+          <w:rFonts w:ascii="Arial" w:hAnsi="Arial" w:cs="Arial"/>
+          <w:sz w:val="22"/>
+          <w:szCs w:val="22"/>
+          <w:shd w:val="clear" w:color="auto" w:fill="FAF9F8"/>
+        </w:rPr>
+      </w:pPr>
+      <w:r>
+        <w:rPr>
+          <w:rFonts w:ascii="Arial" w:hAnsi="Arial" w:cs="Arial"/>
+          <w:sz w:val="22"/>
+          <w:szCs w:val="22"/>
+          <w:shd w:val="clear" w:color="auto" w:fill="FAF9F8"/>
+        </w:rPr>
+        <w:t xml:space="preserve">Resolución Superintendencia </w:t>
+      </w:r>
+      <w:proofErr w:type="spellStart"/>
+      <w:r>
+        <w:rPr>
+          <w:rFonts w:ascii="Arial" w:hAnsi="Arial" w:cs="Arial"/>
+          <w:sz w:val="22"/>
+          <w:szCs w:val="22"/>
+          <w:shd w:val="clear" w:color="auto" w:fill="FAF9F8"/>
+        </w:rPr>
+        <w:t>N°</w:t>
+      </w:r>
+      <w:proofErr w:type="spellEnd"/>
+      <w:r>
+        <w:rPr>
+          <w:rFonts w:ascii="Arial" w:hAnsi="Arial" w:cs="Arial"/>
+          <w:sz w:val="22"/>
+          <w:szCs w:val="22"/>
+          <w:shd w:val="clear" w:color="auto" w:fill="FAF9F8"/>
+        </w:rPr>
+        <w:t xml:space="preserve"> 248-2025/SUNAT - Procedimiento Especifico DESPA-PE.01.13 (versión 3) Importación De Mercancías Sujetas Al Protocolo Modificatorio Del Convenio De Cooperación Aduanera Peruano-</w:t>
+      </w:r>
+      <w:proofErr w:type="gramStart"/>
+      <w:r>
+        <w:rPr>
+          <w:rFonts w:ascii="Arial" w:hAnsi="Arial" w:cs="Arial"/>
+          <w:sz w:val="22"/>
+          <w:szCs w:val="22"/>
+          <w:shd w:val="clear" w:color="auto" w:fill="FAF9F8"/>
+        </w:rPr>
+        <w:t>Colombiano</w:t>
+      </w:r>
+      <w:proofErr w:type="gramEnd"/>
+    </w:p>
+    <w:p>
+      <w:pPr>
+        <w:autoSpaceDE w:val="0"/>
+        <w:autoSpaceDN w:val="0"/>
+        <w:adjustRightInd w:val="0"/>
+        <w:spacing w:after="0" w:line="240" w:lineRule="auto"/>
+        <w:jc w:val="both"/>
+        <w:rPr>
+          <w:rFonts w:ascii="Arial" w:hAnsi="Arial" w:cs="Arial"/>
+          <w:sz w:val="22"/>
+          <w:szCs w:val="22"/>
+          <w:shd w:val="clear" w:color="auto" w:fill="FAF9F8"/>
+        </w:rPr>
+      </w:pPr>
+      <w:r>
+        <w:rPr>
+          <w:rFonts w:ascii="Arial" w:hAnsi="Arial" w:cs="Arial"/>
+          <w:sz w:val="22"/>
+          <w:szCs w:val="22"/>
+          <w:shd w:val="clear" w:color="auto" w:fill="FAF9F8"/>
+        </w:rPr>
         <w:t>{/</w:t>
       </w:r>
       <w:proofErr w:type="spellStart"/>
@@ -1548,8 +1953,9 @@
           <w:rFonts w:ascii="Arial" w:hAnsi="Arial" w:cs="Arial"/>
           <w:sz w:val="22"/>
           <w:szCs w:val="22"/>
-        </w:rPr>
-        <w:t>estadoPECOyAMAZONIA</w:t>
+          <w:shd w:val="clear" w:color="auto" w:fill="FAF9F8"/>
+        </w:rPr>
+        <w:t>estadoOnlyPECO</w:t>
       </w:r>
       <w:proofErr w:type="spellEnd"/>
       <w:r>
@@ -1561,6 +1967,21 @@
         </w:rPr>
         <w:t>}</w:t>
       </w:r>
+    </w:p>
+    <w:p>
+      <w:pPr>
+        <w:autoSpaceDE w:val="0"/>
+        <w:autoSpaceDN w:val="0"/>
+        <w:adjustRightInd w:val="0"/>
+        <w:spacing w:after="0" w:line="240" w:lineRule="auto"/>
+        <w:jc w:val="both"/>
+        <w:rPr>
+          <w:rFonts w:ascii="Arial" w:hAnsi="Arial" w:cs="Arial"/>
+          <w:sz w:val="22"/>
+          <w:szCs w:val="22"/>
+          <w:shd w:val="clear" w:color="auto" w:fill="FAF9F8"/>
+        </w:rPr>
+      </w:pPr>
     </w:p>
     <w:p>
       <w:pPr>
@@ -2934,7 +3355,6 @@
           <w:rFonts w:ascii="Arial" w:hAnsi="Arial" w:cs="Arial"/>
           <w:sz w:val="22"/>
           <w:szCs w:val="22"/>
-          <w:shd w:val="clear" w:color="auto" w:fill="FAF9F8"/>
         </w:rPr>
       </w:pPr>
       <w:r>
@@ -2962,6 +3382,29 @@
           <w:szCs w:val="22"/>
         </w:rPr>
         <w:t>}</w:t>
+      </w:r>
+    </w:p>
+    <w:p>
+      <w:pPr>
+        <w:tabs>
+          <w:tab w:val="left" w:pos="3544"/>
+        </w:tabs>
+        <w:spacing w:after="0" w:line="240" w:lineRule="auto"/>
+        <w:ind w:left="284"/>
+        <w:jc w:val="both"/>
+        <w:rPr>
+          <w:rFonts w:ascii="Arial" w:hAnsi="Arial" w:cs="Arial"/>
+          <w:sz w:val="22"/>
+          <w:szCs w:val="22"/>
+        </w:rPr>
+      </w:pPr>
+      <w:r>
+        <w:rPr>
+          <w:rFonts w:ascii="Arial" w:hAnsi="Arial" w:cs="Arial"/>
+          <w:sz w:val="22"/>
+          <w:szCs w:val="22"/>
+        </w:rPr>
+        <w:t>{#estadoOnlyPECO}</w:t>
       </w:r>
     </w:p>
     <w:p>
@@ -2979,13 +3422,180 @@
           <w:shd w:val="clear" w:color="auto" w:fill="FAF9F8"/>
         </w:rPr>
       </w:pPr>
-      <w:r>
+      <w:proofErr w:type="spellStart"/>
+      <w:r>
+        <w:rPr>
+          <w:rFonts w:ascii="Arial" w:hAnsi="Arial" w:cs="Arial"/>
+          <w:sz w:val="22"/>
+          <w:szCs w:val="22"/>
+        </w:rPr>
+        <w:t>El</w:t>
+      </w:r>
+      <w:proofErr w:type="spellEnd"/>
+      <w:r>
+        <w:rPr>
+          <w:rFonts w:ascii="Arial" w:hAnsi="Arial" w:cs="Arial"/>
+          <w:sz w:val="22"/>
+          <w:szCs w:val="22"/>
+        </w:rPr>
+        <w:t xml:space="preserve"> {fromDam-</w:t>
+      </w:r>
+      <w:proofErr w:type="gramStart"/>
+      <w:r>
+        <w:rPr>
+          <w:rFonts w:ascii="Arial" w:hAnsi="Arial" w:cs="Arial"/>
+          <w:sz w:val="22"/>
+          <w:szCs w:val="22"/>
+        </w:rPr>
+        <w:t>fechaCancelacionTributos}</w:t>
+      </w:r>
+      <w:r>
+        <w:rPr>
+          <w:rFonts w:ascii="Arial" w:hAnsi="Arial" w:cs="Arial"/>
+          <w:b/>
+          <w:bCs/>
+          <w:color w:val="FF0000"/>
+          <w:sz w:val="22"/>
+          <w:szCs w:val="22"/>
+        </w:rPr>
+        <w:t>{</w:t>
+      </w:r>
+      <w:proofErr w:type="gramEnd"/>
+      <w:r>
+        <w:rPr>
+          <w:rFonts w:ascii="Arial" w:hAnsi="Arial" w:cs="Arial"/>
+          <w:b/>
+          <w:bCs/>
+          <w:color w:val="FF0000"/>
+          <w:sz w:val="22"/>
+          <w:szCs w:val="22"/>
+        </w:rPr>
+        <w:t>fromDam-fechaCancelacionTributosRRR}</w:t>
+      </w:r>
+      <w:r>
+        <w:rPr>
+          <w:rFonts w:ascii="Arial" w:hAnsi="Arial" w:cs="Arial"/>
+          <w:sz w:val="22"/>
+          <w:szCs w:val="22"/>
+        </w:rPr>
+        <w:t xml:space="preserve"> </w:t>
+      </w:r>
+      <w:r>
+        <w:rPr>
+          <w:rFonts w:ascii="Arial" w:hAnsi="Arial" w:cs="Arial"/>
+          <w:bCs/>
+          <w:color w:val="000000"/>
+          <w:sz w:val="22"/>
+          <w:szCs w:val="22"/>
+        </w:rPr>
+        <w:t>se</w:t>
+      </w:r>
+      <w:r>
+        <w:rPr>
+          <w:rFonts w:ascii="Arial" w:hAnsi="Arial" w:cs="Arial"/>
+          <w:sz w:val="22"/>
+          <w:szCs w:val="22"/>
+        </w:rPr>
+        <w:t xml:space="preserve"> cancelan los tributos sujetos a regulación, correspondientes a la importación señalada en el considerando anterior, siendo abonados a la “Sub-Cuenta Especial Tesoro Público – D.S. n.º 015-94-EF” el importe de S/ {</w:t>
+      </w:r>
+      <w:proofErr w:type="spellStart"/>
+      <w:r>
+        <w:rPr>
+          <w:rFonts w:ascii="Arial" w:hAnsi="Arial" w:cs="Arial"/>
+          <w:sz w:val="22"/>
+          <w:szCs w:val="22"/>
+        </w:rPr>
+        <w:t>textoTotReguPECO</w:t>
+      </w:r>
+      <w:proofErr w:type="spellEnd"/>
+      <w:r>
+        <w:rPr>
+          <w:rFonts w:ascii="Arial" w:hAnsi="Arial" w:cs="Arial"/>
+          <w:sz w:val="22"/>
+          <w:szCs w:val="22"/>
+        </w:rPr>
+        <w:t>} en cumplimiento de la Resolución Ministerial n.º107-94-EF/10.</w:t>
+      </w:r>
+    </w:p>
+    <w:p>
+      <w:pPr>
+        <w:autoSpaceDE w:val="0"/>
+        <w:autoSpaceDN w:val="0"/>
+        <w:adjustRightInd w:val="0"/>
+        <w:spacing w:after="0" w:line="240" w:lineRule="auto"/>
+        <w:ind w:left="284"/>
+        <w:jc w:val="both"/>
         <w:rPr>
           <w:rFonts w:ascii="Arial" w:hAnsi="Arial" w:cs="Arial"/>
           <w:sz w:val="22"/>
           <w:szCs w:val="22"/>
           <w:shd w:val="clear" w:color="auto" w:fill="FAF9F8"/>
         </w:rPr>
+      </w:pPr>
+    </w:p>
+    <w:p>
+      <w:pPr>
+        <w:tabs>
+          <w:tab w:val="left" w:pos="3544"/>
+        </w:tabs>
+        <w:spacing w:after="0" w:line="240" w:lineRule="auto"/>
+        <w:ind w:left="284"/>
+        <w:jc w:val="both"/>
+        <w:rPr>
+          <w:rFonts w:ascii="Arial" w:hAnsi="Arial" w:cs="Arial"/>
+          <w:sz w:val="22"/>
+          <w:szCs w:val="22"/>
+        </w:rPr>
+      </w:pPr>
+      <w:r>
+        <w:rPr>
+          <w:rFonts w:ascii="Arial" w:hAnsi="Arial" w:cs="Arial"/>
+          <w:sz w:val="22"/>
+          <w:szCs w:val="22"/>
+        </w:rPr>
+        <w:t>{/</w:t>
+      </w:r>
+      <w:proofErr w:type="spellStart"/>
+      <w:r>
+        <w:rPr>
+          <w:rFonts w:ascii="Arial" w:hAnsi="Arial" w:cs="Arial"/>
+          <w:sz w:val="22"/>
+          <w:szCs w:val="22"/>
+        </w:rPr>
+        <w:t>estadoOnlyPECO</w:t>
+      </w:r>
+      <w:proofErr w:type="spellEnd"/>
+      <w:r>
+        <w:rPr>
+          <w:rFonts w:ascii="Arial" w:hAnsi="Arial" w:cs="Arial"/>
+          <w:sz w:val="22"/>
+          <w:szCs w:val="22"/>
+        </w:rPr>
+        <w:t>}</w:t>
+      </w:r>
+    </w:p>
+    <w:p>
+      <w:pPr>
+        <w:autoSpaceDE w:val="0"/>
+        <w:autoSpaceDN w:val="0"/>
+        <w:adjustRightInd w:val="0"/>
+        <w:spacing w:after="0" w:line="240" w:lineRule="auto"/>
+        <w:ind w:left="284"/>
+        <w:jc w:val="both"/>
+        <w:rPr>
+          <w:rFonts w:ascii="Arial" w:hAnsi="Arial" w:cs="Arial"/>
+          <w:sz w:val="22"/>
+          <w:szCs w:val="22"/>
+          <w:shd w:val="clear" w:color="auto" w:fill="FAF9F8"/>
+        </w:rPr>
+      </w:pPr>
+      <w:r>
+        <w:rPr>
+          <w:rFonts w:ascii="Arial" w:hAnsi="Arial" w:cs="Arial"/>
+          <w:sz w:val="22"/>
+          <w:szCs w:val="22"/>
+          <w:shd w:val="clear" w:color="auto" w:fill="FAF9F8"/>
+        </w:rPr>
         <w:t xml:space="preserve">Con </w:t>
       </w:r>
       <w:bookmarkStart w:id="0" w:name="_Hlk230161833"/>
@@ -3152,7 +3762,6 @@
           <w:sz w:val="22"/>
           <w:szCs w:val="22"/>
         </w:rPr>
-        <w:lastRenderedPageBreak/>
         <w:t>{</w:t>
       </w:r>
       <w:proofErr w:type="spellStart"/>
@@ -3726,7 +4335,27 @@
           <w:sz w:val="22"/>
           <w:szCs w:val="22"/>
         </w:rPr>
-        <w:t>}, en el {</w:t>
+        <w:t>}, en</w:t>
+      </w:r>
+      <w:r>
+        <w:rPr>
+          <w:rFonts w:ascii="Arial" w:hAnsi="Arial" w:cs="Arial"/>
+          <w:i/>
+          <w:iCs/>
+          <w:color w:val="000000" w:themeColor="text1"/>
+          <w:sz w:val="22"/>
+          <w:szCs w:val="22"/>
+        </w:rPr>
+        <w:t xml:space="preserve"> </w:t>
+      </w:r>
+      <w:r>
+        <w:rPr>
+          <w:rFonts w:ascii="Arial" w:hAnsi="Arial" w:cs="Arial"/>
+          <w:color w:val="000000" w:themeColor="text1"/>
+          <w:sz w:val="22"/>
+          <w:szCs w:val="22"/>
+        </w:rPr>
+        <w:t>el {</w:t>
       </w:r>
       <w:proofErr w:type="spellStart"/>
       <w:r>
@@ -3746,7 +4375,7 @@
           <w:sz w:val="22"/>
           <w:szCs w:val="22"/>
         </w:rPr>
-        <w:t>} Ley n.º 27037 - “Ley de Promoción de la Inversión en la Amazonía”, su Reglamento aprobado con Decreto Supremo n.º 103-99-EF, Ley n.º 30896, Resolución Ministerial n.º 245-99-EF/15 y normas legales conexas</w:t>
+        <w:t>} y normas legales conexas</w:t>
       </w:r>
       <w:r>
         <w:rPr>
@@ -3792,7 +4421,7 @@
           <w:sz w:val="22"/>
           <w:szCs w:val="22"/>
         </w:rPr>
-        <w:t>estadoPECOyAMAZONIA</w:t>
+        <w:t>estadoIncluyePeco</w:t>
       </w:r>
       <w:r>
         <w:rPr>
@@ -3829,7 +4458,17 @@
           <w:sz w:val="22"/>
           <w:szCs w:val="22"/>
         </w:rPr>
-        <w:t>Supremo n.º015-94-EF, en el artículo 1° dispone lo siguiente: “El pago de los impuestos que se haya efectuado en la importación de mercancías cuyo destino final sea la zona de selva comprendida en el Convenio de Cooperación Aduanera Peruano - Colombiano, será considerado como un pago a cuenta sujeto a regularización en las Aduanas de destino”, asimismo señal a que: “La regularización procederá luego de realizado el reconocimiento físico de las mercancías por la aduana de destino en la zona de selva. De ser el caso, y con sujeción a lo dispuesto en el Convenio de Cooperación Aduanera Peruano Colombiano, el monto pagado en exceso será devuelto"</w:t>
+        <w:t xml:space="preserve">Supremo n.º015-94-EF, en el artículo 1° dispone lo siguiente: “El pago de los impuestos que se haya efectuado en la importación de mercancías cuyo destino final sea la zona de selva comprendida en el Convenio de Cooperación Aduanera Peruano - Colombiano, será considerado como un pago a cuenta sujeto a </w:t>
+      </w:r>
+      <w:r>
+        <w:rPr>
+          <w:rFonts w:ascii="Arial" w:hAnsi="Arial" w:cs="Arial"/>
+          <w:color w:val="000000" w:themeColor="text1"/>
+          <w:sz w:val="22"/>
+          <w:szCs w:val="22"/>
+        </w:rPr>
+        <w:lastRenderedPageBreak/>
+        <w:t>regularización en las Aduanas de destino”, asimismo señal a que: “La regularización procederá luego de realizado el reconocimiento físico de las mercancías por la aduana de destino en la zona de selva. De ser el caso, y con sujeción a lo dispuesto en el Convenio de Cooperación Aduanera Peruano Colombiano, el monto pagado en exceso será devuelto"</w:t>
       </w:r>
       <w:r>
         <w:rPr>
@@ -3872,7 +4511,7 @@
           <w:sz w:val="22"/>
           <w:szCs w:val="22"/>
         </w:rPr>
-        <w:t>estadoPECOyAMAZONIA</w:t>
+        <w:t>estadoIncluyePeco</w:t>
       </w:r>
       <w:proofErr w:type="spellEnd"/>
       <w:r>
@@ -4016,6 +4655,9 @@
     </w:p>
     <w:p>
       <w:pPr>
+        <w:tabs>
+          <w:tab w:val="left" w:pos="5054"/>
+        </w:tabs>
         <w:spacing w:after="0"/>
         <w:ind w:left="284"/>
         <w:jc w:val="both"/>
@@ -4055,6 +4697,43 @@
     <w:p>
       <w:pPr>
         <w:spacing w:after="0"/>
+        <w:jc w:val="both"/>
+        <w:rPr>
+          <w:rFonts w:ascii="Arial" w:hAnsi="Arial" w:cs="Arial"/>
+          <w:sz w:val="22"/>
+          <w:szCs w:val="22"/>
+        </w:rPr>
+      </w:pPr>
+      <w:r>
+        <w:rPr>
+          <w:rFonts w:ascii="Arial" w:hAnsi="Arial" w:cs="Arial"/>
+          <w:sz w:val="22"/>
+          <w:szCs w:val="22"/>
+        </w:rPr>
+        <w:t>{#</w:t>
+      </w:r>
+      <w:bookmarkStart w:id="3" w:name="_Hlk231360455"/>
+      <w:r>
+        <w:rPr>
+          <w:rFonts w:ascii="Arial" w:hAnsi="Arial" w:cs="Arial"/>
+          <w:sz w:val="22"/>
+          <w:szCs w:val="22"/>
+        </w:rPr>
+        <w:t>estadoIncluyeAmazonia</w:t>
+      </w:r>
+      <w:bookmarkEnd w:id="3"/>
+      <w:r>
+        <w:rPr>
+          <w:rFonts w:ascii="Arial" w:hAnsi="Arial" w:cs="Arial"/>
+          <w:sz w:val="22"/>
+          <w:szCs w:val="22"/>
+        </w:rPr>
+        <w:t>}</w:t>
+      </w:r>
+    </w:p>
+    <w:p>
+      <w:pPr>
+        <w:spacing w:after="0"/>
         <w:ind w:left="284"/>
         <w:jc w:val="both"/>
         <w:rPr>
@@ -4063,33 +4742,17 @@
           <w:szCs w:val="22"/>
         </w:rPr>
       </w:pPr>
-      <w:bookmarkStart w:id="3" w:name="_Hlk231251669"/>
-      <w:r>
-        <w:rPr>
-          <w:rFonts w:ascii="Arial" w:hAnsi="Arial" w:cs="Arial"/>
-          <w:sz w:val="22"/>
-          <w:szCs w:val="22"/>
-        </w:rPr>
-        <w:t>{#</w:t>
-      </w:r>
-      <w:r>
-        <w:rPr>
-          <w:rFonts w:ascii="Arial" w:hAnsi="Arial" w:cs="Arial"/>
-          <w:sz w:val="22"/>
-          <w:szCs w:val="22"/>
-        </w:rPr>
-        <w:t>estadoJuridiccionLoreto</w:t>
-      </w:r>
-      <w:r>
-        <w:rPr>
-          <w:rFonts w:ascii="Arial" w:hAnsi="Arial" w:cs="Arial"/>
-          <w:sz w:val="22"/>
-          <w:szCs w:val="22"/>
-        </w:rPr>
-        <w:t>}</w:t>
-      </w:r>
-    </w:p>
-    <w:bookmarkEnd w:id="3"/>
+      <w:bookmarkStart w:id="4" w:name="_Hlk231251669"/>
+      <w:r>
+        <w:rPr>
+          <w:rFonts w:ascii="Arial" w:hAnsi="Arial" w:cs="Arial"/>
+          <w:sz w:val="22"/>
+          <w:szCs w:val="22"/>
+        </w:rPr>
+        <w:t>{#estadoJuridiccionLoreto}</w:t>
+      </w:r>
+    </w:p>
+    <w:bookmarkEnd w:id="4"/>
     <w:p>
       <w:pPr>
         <w:spacing w:after="0" w:line="240" w:lineRule="auto"/>
@@ -4109,23 +4772,22 @@
         </w:rPr>
         <w:t xml:space="preserve">La </w:t>
       </w:r>
-      <w:bookmarkStart w:id="4" w:name="_Hlk231251727"/>
-      <w:r>
-        <w:rPr>
-          <w:rFonts w:ascii="Arial" w:hAnsi="Arial" w:cs="Arial"/>
-          <w:sz w:val="22"/>
-          <w:szCs w:val="22"/>
-        </w:rPr>
-        <w:t xml:space="preserve">Tercera Disposición Complementaria de la Ley n.º 27037 prorrogada por la Ley n.º 30897, prescribe que la importación de bienes que se destine al consumo en la Amazonía, se encontrará exonerada del Impuesto General a las Ventas hasta el </w:t>
-      </w:r>
-      <w:r>
-        <w:rPr>
-          <w:rFonts w:ascii="Arial" w:hAnsi="Arial" w:cs="Arial"/>
-          <w:sz w:val="22"/>
-          <w:szCs w:val="22"/>
-        </w:rPr>
-        <w:lastRenderedPageBreak/>
-        <w:t>31.12.2019, con excepción de las partidas arancelarias de los capítulos 84, 85 y 87 del Arancel de Aduanas cuya exoneración se ampliará hasta el 31.12.2028, para cuyos efectos deberá cumplir con los requisitos señalados en los artículos 2º y 18º del Reglamento de dicha Ley aprobado con Decreto Supremo n.º</w:t>
+      <w:bookmarkStart w:id="5" w:name="_Hlk231251727"/>
+      <w:r>
+        <w:rPr>
+          <w:rFonts w:ascii="Arial" w:hAnsi="Arial" w:cs="Arial"/>
+          <w:sz w:val="22"/>
+          <w:szCs w:val="22"/>
+        </w:rPr>
+        <w:t>Tercera Disposición Complementaria de la Ley n.º 27037 prorrogada por la Ley n.º 30897, prescribe que la</w:t>
+      </w:r>
+      <w:r>
+        <w:rPr>
+          <w:rFonts w:ascii="Arial" w:hAnsi="Arial" w:cs="Arial"/>
+          <w:sz w:val="22"/>
+          <w:szCs w:val="22"/>
+        </w:rPr>
+        <w:t xml:space="preserve"> importación de bienes que se destine al consumo en la Amazonía, se encontrará exonerada del Impuesto General a las Ventas hasta el 31.12.2019, con excepción de las partidas arancelarias de los capítulos 84, 85 y 87 del Arancel de Aduanas cuya exoneración se ampliará hasta el 31.12.2028, para cuyos efectos deberá cumplir con los requisitos señalados en los artículos 2º y 18º del Reglamento de dicha Ley aprobado con Decreto Supremo n.º</w:t>
       </w:r>
       <w:r>
         <w:rPr>
@@ -4151,7 +4813,7 @@
         </w:rPr>
         <w:t>.</w:t>
       </w:r>
-      <w:bookmarkEnd w:id="4"/>
+      <w:bookmarkEnd w:id="5"/>
     </w:p>
     <w:p>
       <w:pPr>
@@ -4176,7 +4838,7 @@
           <w:szCs w:val="22"/>
         </w:rPr>
       </w:pPr>
-      <w:bookmarkStart w:id="5" w:name="_Hlk231251680"/>
+      <w:bookmarkStart w:id="6" w:name="_Hlk231251680"/>
       <w:r>
         <w:rPr>
           <w:rFonts w:ascii="Arial" w:hAnsi="Arial" w:cs="Arial"/>
@@ -4215,8 +4877,8 @@
           <w:szCs w:val="22"/>
         </w:rPr>
       </w:pPr>
-      <w:bookmarkStart w:id="6" w:name="_Hlk231251750"/>
-      <w:bookmarkEnd w:id="5"/>
+      <w:bookmarkStart w:id="7" w:name="_Hlk231251750"/>
+      <w:bookmarkEnd w:id="6"/>
       <w:r>
         <w:rPr>
           <w:rFonts w:ascii="Arial" w:hAnsi="Arial" w:cs="Arial"/>
@@ -4242,7 +4904,7 @@
         <w:t>}</w:t>
       </w:r>
     </w:p>
-    <w:bookmarkEnd w:id="6"/>
+    <w:bookmarkEnd w:id="7"/>
     <w:p>
       <w:pPr>
         <w:spacing w:after="0" w:line="240" w:lineRule="auto"/>
@@ -4262,7 +4924,7 @@
         </w:rPr>
         <w:t xml:space="preserve">La </w:t>
       </w:r>
-      <w:bookmarkStart w:id="7" w:name="_Hlk231251741"/>
+      <w:bookmarkStart w:id="8" w:name="_Hlk231251741"/>
       <w:r>
         <w:rPr>
           <w:rFonts w:ascii="Arial" w:hAnsi="Arial" w:cs="Arial"/>
@@ -4399,7 +5061,7 @@
         </w:rPr>
         <w:t xml:space="preserve">245-99-EF/15.  </w:t>
       </w:r>
-      <w:bookmarkEnd w:id="7"/>
+      <w:bookmarkEnd w:id="8"/>
     </w:p>
     <w:p>
       <w:pPr>
@@ -4412,6 +5074,33 @@
           <w:szCs w:val="22"/>
         </w:rPr>
       </w:pPr>
+      <w:bookmarkStart w:id="9" w:name="_Hlk231251760"/>
+      <w:r>
+        <w:rPr>
+          <w:rFonts w:ascii="Arial" w:hAnsi="Arial" w:cs="Arial"/>
+          <w:sz w:val="22"/>
+          <w:szCs w:val="22"/>
+        </w:rPr>
+        <w:t>{/</w:t>
+      </w:r>
+      <w:proofErr w:type="spellStart"/>
+      <w:r>
+        <w:rPr>
+          <w:rFonts w:ascii="Arial" w:hAnsi="Arial" w:cs="Arial"/>
+          <w:sz w:val="22"/>
+          <w:szCs w:val="22"/>
+        </w:rPr>
+        <w:t>estadoJuridiccionOtros</w:t>
+      </w:r>
+      <w:proofErr w:type="spellEnd"/>
+      <w:r>
+        <w:rPr>
+          <w:rFonts w:ascii="Arial" w:hAnsi="Arial" w:cs="Arial"/>
+          <w:sz w:val="22"/>
+          <w:szCs w:val="22"/>
+        </w:rPr>
+        <w:t>}</w:t>
+      </w:r>
     </w:p>
     <w:p>
       <w:pPr>
@@ -4424,35 +5113,8 @@
           <w:szCs w:val="22"/>
         </w:rPr>
       </w:pPr>
-      <w:bookmarkStart w:id="8" w:name="_Hlk231251760"/>
-      <w:r>
-        <w:rPr>
-          <w:rFonts w:ascii="Arial" w:hAnsi="Arial" w:cs="Arial"/>
-          <w:sz w:val="22"/>
-          <w:szCs w:val="22"/>
-        </w:rPr>
-        <w:t>{/</w:t>
-      </w:r>
-      <w:proofErr w:type="spellStart"/>
-      <w:r>
-        <w:rPr>
-          <w:rFonts w:ascii="Arial" w:hAnsi="Arial" w:cs="Arial"/>
-          <w:sz w:val="22"/>
-          <w:szCs w:val="22"/>
-        </w:rPr>
-        <w:t>estadoJuridiccionOtros</w:t>
-      </w:r>
-      <w:proofErr w:type="spellEnd"/>
-      <w:r>
-        <w:rPr>
-          <w:rFonts w:ascii="Arial" w:hAnsi="Arial" w:cs="Arial"/>
-          <w:sz w:val="22"/>
-          <w:szCs w:val="22"/>
-        </w:rPr>
-        <w:t>}</w:t>
-      </w:r>
-    </w:p>
-    <w:bookmarkEnd w:id="8"/>
+    </w:p>
+    <w:bookmarkEnd w:id="9"/>
     <w:p>
       <w:pPr>
         <w:spacing w:after="0" w:line="240" w:lineRule="auto"/>
@@ -4614,7 +5276,112 @@
         <w:t>:</w:t>
       </w:r>
     </w:p>
-    <w:p/>
+    <w:p>
+      <w:r>
+        <w:t>{/</w:t>
+      </w:r>
+      <w:proofErr w:type="spellStart"/>
+      <w:r>
+        <w:rPr>
+          <w:rFonts w:ascii="Arial" w:hAnsi="Arial" w:cs="Arial"/>
+          <w:sz w:val="22"/>
+          <w:szCs w:val="22"/>
+        </w:rPr>
+        <w:t>estadoIncluyeAmazonia</w:t>
+      </w:r>
+      <w:proofErr w:type="spellEnd"/>
+      <w:r>
+        <w:t>}</w:t>
+      </w:r>
+    </w:p>
+    <w:p>
+      <w:pPr>
+        <w:rPr>
+          <w:sz w:val="22"/>
+          <w:szCs w:val="22"/>
+        </w:rPr>
+      </w:pPr>
+      <w:r>
+        <w:rPr>
+          <w:sz w:val="22"/>
+          <w:szCs w:val="22"/>
+        </w:rPr>
+        <w:t>{#</w:t>
+      </w:r>
+      <w:r>
+        <w:rPr>
+          <w:rFonts w:ascii="Arial" w:hAnsi="Arial" w:cs="Arial"/>
+          <w:sz w:val="22"/>
+          <w:szCs w:val="22"/>
+        </w:rPr>
+        <w:t>estadoOnlyPECO</w:t>
+      </w:r>
+      <w:r>
+        <w:rPr>
+          <w:sz w:val="22"/>
+          <w:szCs w:val="22"/>
+        </w:rPr>
+        <w:t>}</w:t>
+      </w:r>
+    </w:p>
+    <w:p>
+      <w:pPr>
+        <w:ind w:left="426"/>
+        <w:rPr>
+          <w:sz w:val="22"/>
+          <w:szCs w:val="22"/>
+        </w:rPr>
+      </w:pPr>
+      <w:r>
+        <w:rPr>
+          <w:rFonts w:ascii="Arial" w:hAnsi="Arial" w:cs="Arial"/>
+          <w:sz w:val="22"/>
+          <w:szCs w:val="22"/>
+        </w:rPr>
+        <w:lastRenderedPageBreak/>
+        <w:t>De acuerdo a lo requerido por la empresa importadora, se determina lo siguiente:</w:t>
+      </w:r>
+    </w:p>
+    <w:p>
+      <w:pPr>
+        <w:rPr>
+          <w:sz w:val="22"/>
+          <w:szCs w:val="22"/>
+        </w:rPr>
+      </w:pPr>
+      <w:r>
+        <w:rPr>
+          <w:sz w:val="22"/>
+          <w:szCs w:val="22"/>
+        </w:rPr>
+        <w:t>{/</w:t>
+      </w:r>
+      <w:proofErr w:type="spellStart"/>
+      <w:r>
+        <w:rPr>
+          <w:rFonts w:ascii="Arial" w:hAnsi="Arial" w:cs="Arial"/>
+          <w:sz w:val="22"/>
+          <w:szCs w:val="22"/>
+        </w:rPr>
+        <w:t>estadoOnlyPECO</w:t>
+      </w:r>
+      <w:proofErr w:type="spellEnd"/>
+      <w:r>
+        <w:rPr>
+          <w:sz w:val="22"/>
+          <w:szCs w:val="22"/>
+        </w:rPr>
+        <w:t>}</w:t>
+      </w:r>
+    </w:p>
+    <w:p>
+      <w:pPr>
+        <w:rPr>
+          <w:sz w:val="22"/>
+          <w:szCs w:val="22"/>
+        </w:rPr>
+      </w:pPr>
+    </w:p>
     <w:p>
       <w:pPr>
         <w:spacing w:after="0"/>
@@ -5608,7 +6375,6 @@
         <w:rPr>
           <w:rFonts w:ascii="Arial" w:hAnsi="Arial" w:cs="Arial"/>
         </w:rPr>
-        <w:lastRenderedPageBreak/>
         <w:t>{#veriFaltanGuias}</w:t>
       </w:r>
     </w:p>
@@ -6006,6 +6772,52 @@
     </w:p>
     <w:p>
       <w:pPr>
+        <w:spacing w:after="0" w:line="276" w:lineRule="auto"/>
+        <w:ind w:left="426"/>
+        <w:jc w:val="both"/>
+        <w:rPr>
+          <w:rFonts w:ascii="Arial" w:eastAsia="Times New Roman" w:hAnsi="Arial" w:cs="Arial"/>
+          <w:bCs/>
+          <w:sz w:val="20"/>
+          <w:szCs w:val="20"/>
+          <w:lang w:val="es-ES" w:eastAsia="es-ES"/>
+        </w:rPr>
+      </w:pPr>
+      <w:r>
+        <w:rPr>
+          <w:rFonts w:ascii="Arial" w:eastAsia="Times New Roman" w:hAnsi="Arial" w:cs="Arial"/>
+          <w:bCs/>
+          <w:sz w:val="20"/>
+          <w:szCs w:val="20"/>
+          <w:lang w:val="es-ES" w:eastAsia="es-ES"/>
+        </w:rPr>
+        <w:t>{#</w:t>
+      </w:r>
+      <w:proofErr w:type="spellStart"/>
+      <w:r>
+        <w:rPr>
+          <w:rFonts w:ascii="Arial" w:eastAsia="Times New Roman" w:hAnsi="Arial" w:cs="Arial"/>
+          <w:bCs/>
+          <w:sz w:val="20"/>
+          <w:szCs w:val="20"/>
+          <w:lang w:eastAsia="es-ES"/>
+        </w:rPr>
+        <w:t>estadoIncluyeAmazonia</w:t>
+      </w:r>
+      <w:proofErr w:type="spellEnd"/>
+      <w:r>
+        <w:rPr>
+          <w:rFonts w:ascii="Arial" w:eastAsia="Times New Roman" w:hAnsi="Arial" w:cs="Arial"/>
+          <w:bCs/>
+          <w:sz w:val="20"/>
+          <w:szCs w:val="20"/>
+          <w:lang w:val="es-ES" w:eastAsia="es-ES"/>
+        </w:rPr>
+        <w:t>}</w:t>
+      </w:r>
+    </w:p>
+    <w:p>
+      <w:pPr>
         <w:spacing w:after="0" w:line="240" w:lineRule="auto"/>
         <w:ind w:left="426"/>
         <w:jc w:val="both"/>
@@ -6026,7 +6838,156 @@
     </w:p>
     <w:p>
       <w:pPr>
+        <w:spacing w:after="0" w:line="276" w:lineRule="auto"/>
         <w:ind w:left="426"/>
+        <w:jc w:val="both"/>
+        <w:rPr>
+          <w:rFonts w:ascii="Arial" w:eastAsia="Times New Roman" w:hAnsi="Arial" w:cs="Arial"/>
+          <w:bCs/>
+          <w:sz w:val="20"/>
+          <w:szCs w:val="20"/>
+          <w:lang w:val="es-ES" w:eastAsia="es-ES"/>
+        </w:rPr>
+      </w:pPr>
+      <w:r>
+        <w:rPr>
+          <w:rFonts w:ascii="Arial" w:eastAsia="Times New Roman" w:hAnsi="Arial" w:cs="Arial"/>
+          <w:bCs/>
+          <w:sz w:val="20"/>
+          <w:szCs w:val="20"/>
+          <w:lang w:val="es-ES" w:eastAsia="es-ES"/>
+        </w:rPr>
+        <w:t>{/</w:t>
+      </w:r>
+      <w:proofErr w:type="spellStart"/>
+      <w:r>
+        <w:rPr>
+          <w:rFonts w:ascii="Arial" w:eastAsia="Times New Roman" w:hAnsi="Arial" w:cs="Arial"/>
+          <w:bCs/>
+          <w:sz w:val="20"/>
+          <w:szCs w:val="20"/>
+          <w:lang w:eastAsia="es-ES"/>
+        </w:rPr>
+        <w:t>estadoIncluyeAmazonia</w:t>
+      </w:r>
+      <w:proofErr w:type="spellEnd"/>
+      <w:r>
+        <w:rPr>
+          <w:rFonts w:ascii="Arial" w:eastAsia="Times New Roman" w:hAnsi="Arial" w:cs="Arial"/>
+          <w:bCs/>
+          <w:sz w:val="20"/>
+          <w:szCs w:val="20"/>
+          <w:lang w:val="es-ES" w:eastAsia="es-ES"/>
+        </w:rPr>
+        <w:t>}</w:t>
+      </w:r>
+    </w:p>
+    <w:p>
+      <w:pPr>
+        <w:spacing w:after="0" w:line="240" w:lineRule="auto"/>
+        <w:ind w:left="426"/>
+        <w:jc w:val="both"/>
+        <w:rPr>
+          <w:rFonts w:ascii="Arial" w:eastAsia="Times New Roman" w:hAnsi="Arial" w:cs="Arial"/>
+          <w:color w:val="000000"/>
+          <w:sz w:val="20"/>
+          <w:szCs w:val="20"/>
+          <w:lang w:val="es-ES" w:eastAsia="es-ES"/>
+        </w:rPr>
+      </w:pPr>
+      <w:r>
+        <w:rPr>
+          <w:rFonts w:ascii="Arial" w:eastAsia="Times New Roman" w:hAnsi="Arial" w:cs="Arial"/>
+          <w:color w:val="000000"/>
+          <w:sz w:val="20"/>
+          <w:szCs w:val="20"/>
+          <w:lang w:val="es-ES" w:eastAsia="es-ES"/>
+        </w:rPr>
+        <w:t>{#estadoOnlyPECO}</w:t>
+      </w:r>
+    </w:p>
+    <w:p>
+      <w:pPr>
+        <w:spacing w:after="0" w:line="240" w:lineRule="auto"/>
+        <w:ind w:left="426"/>
+        <w:jc w:val="both"/>
+        <w:rPr>
+          <w:rFonts w:ascii="Arial" w:eastAsia="Times New Roman" w:hAnsi="Arial" w:cs="Arial"/>
+          <w:color w:val="000000"/>
+          <w:sz w:val="20"/>
+          <w:szCs w:val="20"/>
+          <w:lang w:val="es-ES" w:eastAsia="es-ES"/>
+        </w:rPr>
+      </w:pPr>
+      <w:r>
+        <w:rPr>
+          <w:rFonts w:ascii="Arial" w:eastAsia="Times New Roman" w:hAnsi="Arial" w:cs="Arial"/>
+          <w:color w:val="000000"/>
+          <w:sz w:val="20"/>
+          <w:szCs w:val="20"/>
+          <w:lang w:val="es-ES" w:eastAsia="es-ES"/>
+        </w:rPr>
+        <w:t>Se verificó que lo solicitado a regularización se encuentra negociado en el Arancel Común Anexo al Protocolo Modificatorio del Convenio de Cooperación Aduanero Peruano Colombiano con una tasa Ad/Valorem – Libre:</w:t>
+      </w:r>
+    </w:p>
+    <w:p>
+      <w:pPr>
+        <w:spacing w:after="0" w:line="240" w:lineRule="auto"/>
+        <w:ind w:left="426"/>
+        <w:jc w:val="both"/>
+        <w:rPr>
+          <w:rFonts w:ascii="Arial" w:eastAsia="Times New Roman" w:hAnsi="Arial" w:cs="Arial"/>
+          <w:color w:val="000000"/>
+          <w:sz w:val="20"/>
+          <w:szCs w:val="20"/>
+          <w:lang w:val="es-ES" w:eastAsia="es-ES"/>
+        </w:rPr>
+      </w:pPr>
+      <w:r>
+        <w:rPr>
+          <w:rFonts w:ascii="Arial" w:eastAsia="Times New Roman" w:hAnsi="Arial" w:cs="Arial"/>
+          <w:color w:val="000000"/>
+          <w:sz w:val="20"/>
+          <w:szCs w:val="20"/>
+          <w:lang w:val="es-ES" w:eastAsia="es-ES"/>
+        </w:rPr>
+        <w:lastRenderedPageBreak/>
+        <w:t>{/</w:t>
+      </w:r>
+      <w:proofErr w:type="spellStart"/>
+      <w:r>
+        <w:rPr>
+          <w:rFonts w:ascii="Arial" w:eastAsia="Times New Roman" w:hAnsi="Arial" w:cs="Arial"/>
+          <w:color w:val="000000"/>
+          <w:sz w:val="20"/>
+          <w:szCs w:val="20"/>
+          <w:lang w:val="es-ES" w:eastAsia="es-ES"/>
+        </w:rPr>
+        <w:t>estadoOnlyPECO</w:t>
+      </w:r>
+      <w:proofErr w:type="spellEnd"/>
+      <w:r>
+        <w:rPr>
+          <w:rFonts w:ascii="Arial" w:eastAsia="Times New Roman" w:hAnsi="Arial" w:cs="Arial"/>
+          <w:color w:val="000000"/>
+          <w:sz w:val="20"/>
+          <w:szCs w:val="20"/>
+          <w:lang w:val="es-ES" w:eastAsia="es-ES"/>
+        </w:rPr>
+        <w:t>}</w:t>
+      </w:r>
+    </w:p>
+    <w:p>
+      <w:pPr>
+        <w:spacing w:after="0" w:line="240" w:lineRule="auto"/>
+        <w:jc w:val="both"/>
+        <w:rPr>
+          <w:rFonts w:ascii="Arial" w:eastAsia="Times New Roman" w:hAnsi="Arial" w:cs="Arial"/>
+          <w:color w:val="000000"/>
+          <w:sz w:val="20"/>
+          <w:szCs w:val="20"/>
+          <w:lang w:val="es-ES" w:eastAsia="es-ES"/>
+        </w:rPr>
       </w:pPr>
     </w:p>
     <w:p>
@@ -8108,7 +9069,7 @@
         </w:rPr>
         <w:t>{/</w:t>
       </w:r>
-      <w:bookmarkStart w:id="9" w:name="_Hlk231148438"/>
+      <w:bookmarkStart w:id="10" w:name="_Hlk231148438"/>
       <w:proofErr w:type="spellStart"/>
       <w:r>
         <w:rPr>
@@ -8118,7 +9079,955 @@
         </w:rPr>
         <w:t>estadoPECOyAMAZONIA</w:t>
       </w:r>
-      <w:bookmarkEnd w:id="9"/>
+      <w:bookmarkEnd w:id="10"/>
+      <w:proofErr w:type="spellEnd"/>
+      <w:r>
+        <w:rPr>
+          <w:rFonts w:ascii="Arial" w:hAnsi="Arial" w:cs="Arial"/>
+          <w:sz w:val="20"/>
+          <w:szCs w:val="20"/>
+        </w:rPr>
+        <w:t>}</w:t>
+      </w:r>
+    </w:p>
+    <w:p>
+      <w:pPr>
+        <w:spacing w:line="240" w:lineRule="auto"/>
+        <w:rPr>
+          <w:rFonts w:ascii="Arial" w:hAnsi="Arial" w:cs="Arial"/>
+          <w:sz w:val="20"/>
+          <w:szCs w:val="20"/>
+        </w:rPr>
+      </w:pPr>
+      <w:r>
+        <w:rPr>
+          <w:rFonts w:ascii="Arial" w:hAnsi="Arial" w:cs="Arial"/>
+          <w:sz w:val="20"/>
+          <w:szCs w:val="20"/>
+        </w:rPr>
+        <w:t>{#</w:t>
+      </w:r>
+      <w:r>
+        <w:rPr>
+          <w:rFonts w:ascii="Arial" w:hAnsi="Arial" w:cs="Arial"/>
+          <w:sz w:val="20"/>
+          <w:szCs w:val="20"/>
+        </w:rPr>
+        <w:t>estadoOnlyPECO</w:t>
+      </w:r>
+      <w:r>
+        <w:rPr>
+          <w:rFonts w:ascii="Arial" w:hAnsi="Arial" w:cs="Arial"/>
+          <w:sz w:val="20"/>
+          <w:szCs w:val="20"/>
+        </w:rPr>
+        <w:t>}</w:t>
+      </w:r>
+    </w:p>
+    <w:tbl>
+      <w:tblPr>
+        <w:tblStyle w:val="Tablaconcuadrcula"/>
+        <w:tblW w:w="8210" w:type="dxa"/>
+        <w:tblLook w:val="04A0" w:firstRow="1" w:lastRow="0" w:firstColumn="1" w:lastColumn="0" w:noHBand="0" w:noVBand="1"/>
+      </w:tblPr>
+      <w:tblGrid>
+        <w:gridCol w:w="1748"/>
+        <w:gridCol w:w="2154"/>
+        <w:gridCol w:w="2154"/>
+        <w:gridCol w:w="2154"/>
+      </w:tblGrid>
+      <w:tr>
+        <w:trPr>
+          <w:trHeight w:val="601"/>
+        </w:trPr>
+        <w:tc>
+          <w:tcPr>
+            <w:tcW w:w="1748" w:type="dxa"/>
+            <w:shd w:val="clear" w:color="auto" w:fill="D1D1D1" w:themeFill="background2" w:themeFillShade="E6"/>
+            <w:vAlign w:val="center"/>
+          </w:tcPr>
+          <w:p>
+            <w:pPr>
+              <w:jc w:val="center"/>
+              <w:rPr>
+                <w:rFonts w:ascii="Arial" w:eastAsia="Times New Roman" w:hAnsi="Arial" w:cs="Arial"/>
+                <w:b/>
+                <w:bCs/>
+                <w:color w:val="000000"/>
+                <w:sz w:val="18"/>
+                <w:szCs w:val="18"/>
+                <w:lang w:val="es-ES" w:eastAsia="es-ES"/>
+              </w:rPr>
+            </w:pPr>
+            <w:r>
+              <w:rPr>
+                <w:rFonts w:ascii="Arial" w:hAnsi="Arial" w:cs="Arial"/>
+                <w:b/>
+                <w:bCs/>
+                <w:sz w:val="18"/>
+                <w:szCs w:val="18"/>
+              </w:rPr>
+              <w:t>Concepto</w:t>
+            </w:r>
+          </w:p>
+        </w:tc>
+        <w:tc>
+          <w:tcPr>
+            <w:tcW w:w="2154" w:type="dxa"/>
+            <w:shd w:val="clear" w:color="auto" w:fill="D1D1D1" w:themeFill="background2" w:themeFillShade="E6"/>
+            <w:vAlign w:val="center"/>
+          </w:tcPr>
+          <w:p>
+            <w:pPr>
+              <w:jc w:val="center"/>
+              <w:rPr>
+                <w:rFonts w:ascii="Arial" w:eastAsia="Times New Roman" w:hAnsi="Arial" w:cs="Arial"/>
+                <w:b/>
+                <w:bCs/>
+                <w:color w:val="000000"/>
+                <w:sz w:val="18"/>
+                <w:szCs w:val="18"/>
+                <w:lang w:val="es-ES" w:eastAsia="es-ES"/>
+              </w:rPr>
+            </w:pPr>
+            <w:r>
+              <w:rPr>
+                <w:rFonts w:ascii="Arial" w:hAnsi="Arial" w:cs="Arial"/>
+                <w:b/>
+                <w:bCs/>
+                <w:sz w:val="18"/>
+                <w:szCs w:val="18"/>
+              </w:rPr>
+              <w:t>Liquidación Arancel Nacional</w:t>
+            </w:r>
+          </w:p>
+        </w:tc>
+        <w:tc>
+          <w:tcPr>
+            <w:tcW w:w="2154" w:type="dxa"/>
+            <w:shd w:val="clear" w:color="auto" w:fill="D1D1D1" w:themeFill="background2" w:themeFillShade="E6"/>
+            <w:vAlign w:val="center"/>
+          </w:tcPr>
+          <w:p>
+            <w:pPr>
+              <w:jc w:val="center"/>
+              <w:rPr>
+                <w:rFonts w:ascii="Arial" w:eastAsia="Times New Roman" w:hAnsi="Arial" w:cs="Arial"/>
+                <w:b/>
+                <w:bCs/>
+                <w:color w:val="000000"/>
+                <w:sz w:val="18"/>
+                <w:szCs w:val="18"/>
+                <w:lang w:val="es-ES" w:eastAsia="es-ES"/>
+              </w:rPr>
+            </w:pPr>
+            <w:r>
+              <w:rPr>
+                <w:rFonts w:ascii="Arial" w:hAnsi="Arial" w:cs="Arial"/>
+                <w:b/>
+                <w:bCs/>
+                <w:sz w:val="18"/>
+                <w:szCs w:val="18"/>
+              </w:rPr>
+              <w:t>Tributos No Regularizados</w:t>
+            </w:r>
+          </w:p>
+        </w:tc>
+        <w:tc>
+          <w:tcPr>
+            <w:tcW w:w="2154" w:type="dxa"/>
+            <w:shd w:val="clear" w:color="auto" w:fill="D1D1D1" w:themeFill="background2" w:themeFillShade="E6"/>
+            <w:vAlign w:val="center"/>
+          </w:tcPr>
+          <w:p>
+            <w:pPr>
+              <w:tabs>
+                <w:tab w:val="left" w:pos="1440"/>
+                <w:tab w:val="left" w:pos="2880"/>
+                <w:tab w:val="left" w:pos="4320"/>
+                <w:tab w:val="left" w:pos="5760"/>
+                <w:tab w:val="left" w:pos="7200"/>
+                <w:tab w:val="left" w:pos="8640"/>
+              </w:tabs>
+              <w:jc w:val="center"/>
+              <w:rPr>
+                <w:rFonts w:ascii="Arial" w:hAnsi="Arial" w:cs="Arial"/>
+                <w:b/>
+                <w:bCs/>
+                <w:sz w:val="18"/>
+                <w:szCs w:val="18"/>
+              </w:rPr>
+            </w:pPr>
+            <w:r>
+              <w:rPr>
+                <w:rFonts w:ascii="Arial" w:hAnsi="Arial" w:cs="Arial"/>
+                <w:b/>
+                <w:bCs/>
+                <w:sz w:val="18"/>
+                <w:szCs w:val="18"/>
+              </w:rPr>
+              <w:t xml:space="preserve">Regularización D.S. </w:t>
+            </w:r>
+            <w:r>
+              <w:rPr>
+                <w:rFonts w:ascii="Arial" w:hAnsi="Arial" w:cs="Arial"/>
+                <w:b/>
+                <w:bCs/>
+                <w:sz w:val="18"/>
+                <w:szCs w:val="18"/>
+              </w:rPr>
+              <w:t>n</w:t>
+            </w:r>
+            <w:r>
+              <w:rPr>
+                <w:rFonts w:ascii="Arial" w:hAnsi="Arial" w:cs="Arial"/>
+                <w:b/>
+                <w:bCs/>
+                <w:sz w:val="18"/>
+                <w:szCs w:val="18"/>
+              </w:rPr>
+              <w:t>.º 015-94-EF</w:t>
+            </w:r>
+          </w:p>
+        </w:tc>
+      </w:tr>
+      <w:tr>
+        <w:trPr>
+          <w:trHeight w:val="244"/>
+        </w:trPr>
+        <w:tc>
+          <w:tcPr>
+            <w:tcW w:w="1748" w:type="dxa"/>
+            <w:vAlign w:val="center"/>
+          </w:tcPr>
+          <w:p>
+            <w:pPr>
+              <w:jc w:val="both"/>
+              <w:rPr>
+                <w:rFonts w:ascii="Arial" w:eastAsia="Times New Roman" w:hAnsi="Arial" w:cs="Arial"/>
+                <w:color w:val="000000"/>
+                <w:sz w:val="20"/>
+                <w:szCs w:val="20"/>
+                <w:lang w:val="es-ES" w:eastAsia="es-ES"/>
+              </w:rPr>
+            </w:pPr>
+            <w:r>
+              <w:rPr>
+                <w:rFonts w:ascii="Arial" w:hAnsi="Arial" w:cs="Arial"/>
+                <w:sz w:val="20"/>
+                <w:szCs w:val="20"/>
+              </w:rPr>
+              <w:t>Ad/Valorem</w:t>
+            </w:r>
+          </w:p>
+        </w:tc>
+        <w:tc>
+          <w:tcPr>
+            <w:tcW w:w="2154" w:type="dxa"/>
+            <w:vAlign w:val="center"/>
+          </w:tcPr>
+          <w:p>
+            <w:pPr>
+              <w:jc w:val="right"/>
+              <w:rPr>
+                <w:rFonts w:ascii="Arial" w:eastAsia="Times New Roman" w:hAnsi="Arial" w:cs="Arial"/>
+                <w:color w:val="000000"/>
+                <w:sz w:val="20"/>
+                <w:szCs w:val="20"/>
+                <w:lang w:val="es-ES" w:eastAsia="es-ES"/>
+              </w:rPr>
+            </w:pPr>
+            <w:r>
+              <w:rPr>
+                <w:rFonts w:ascii="Calibri" w:hAnsi="Calibri" w:cs="Calibri"/>
+                <w:color w:val="000000"/>
+                <w:sz w:val="20"/>
+                <w:szCs w:val="20"/>
+              </w:rPr>
+              <w:t>{</w:t>
+            </w:r>
+            <w:proofErr w:type="spellStart"/>
+            <w:r>
+              <w:rPr>
+                <w:rFonts w:ascii="Calibri" w:hAnsi="Calibri" w:cs="Calibri"/>
+                <w:color w:val="000000"/>
+                <w:sz w:val="20"/>
+                <w:szCs w:val="20"/>
+              </w:rPr>
+              <w:t>textoAVLiqu</w:t>
+            </w:r>
+            <w:proofErr w:type="spellEnd"/>
+            <w:r>
+              <w:rPr>
+                <w:rFonts w:ascii="Calibri" w:hAnsi="Calibri" w:cs="Calibri"/>
+                <w:color w:val="000000"/>
+                <w:sz w:val="20"/>
+                <w:szCs w:val="20"/>
+              </w:rPr>
+              <w:t>}</w:t>
+            </w:r>
+          </w:p>
+        </w:tc>
+        <w:tc>
+          <w:tcPr>
+            <w:tcW w:w="2154" w:type="dxa"/>
+            <w:vAlign w:val="center"/>
+          </w:tcPr>
+          <w:p>
+            <w:pPr>
+              <w:jc w:val="right"/>
+              <w:rPr>
+                <w:rFonts w:ascii="Calibri" w:hAnsi="Calibri" w:cs="Calibri"/>
+                <w:color w:val="000000"/>
+                <w:sz w:val="20"/>
+                <w:szCs w:val="20"/>
+              </w:rPr>
+            </w:pPr>
+            <w:r>
+              <w:rPr>
+                <w:rFonts w:ascii="Calibri" w:hAnsi="Calibri" w:cs="Calibri"/>
+                <w:color w:val="000000"/>
+                <w:sz w:val="20"/>
+                <w:szCs w:val="20"/>
+              </w:rPr>
+              <w:t>{</w:t>
+            </w:r>
+            <w:proofErr w:type="spellStart"/>
+            <w:r>
+              <w:rPr>
+                <w:rFonts w:ascii="Calibri" w:hAnsi="Calibri" w:cs="Calibri"/>
+                <w:color w:val="000000"/>
+                <w:sz w:val="20"/>
+                <w:szCs w:val="20"/>
+              </w:rPr>
+              <w:t>textoAVNoReg</w:t>
+            </w:r>
+            <w:proofErr w:type="spellEnd"/>
+            <w:r>
+              <w:rPr>
+                <w:rFonts w:ascii="Calibri" w:hAnsi="Calibri" w:cs="Calibri"/>
+                <w:color w:val="000000"/>
+                <w:sz w:val="20"/>
+                <w:szCs w:val="20"/>
+              </w:rPr>
+              <w:t>}</w:t>
+            </w:r>
+          </w:p>
+        </w:tc>
+        <w:tc>
+          <w:tcPr>
+            <w:tcW w:w="2154" w:type="dxa"/>
+            <w:vAlign w:val="center"/>
+          </w:tcPr>
+          <w:p>
+            <w:pPr>
+              <w:jc w:val="right"/>
+              <w:rPr>
+                <w:rFonts w:ascii="Calibri" w:hAnsi="Calibri" w:cs="Calibri"/>
+                <w:color w:val="000000"/>
+                <w:sz w:val="20"/>
+                <w:szCs w:val="20"/>
+              </w:rPr>
+            </w:pPr>
+            <w:r>
+              <w:rPr>
+                <w:rFonts w:ascii="Calibri" w:hAnsi="Calibri" w:cs="Calibri"/>
+                <w:color w:val="000000"/>
+                <w:sz w:val="20"/>
+                <w:szCs w:val="20"/>
+              </w:rPr>
+              <w:t>{</w:t>
+            </w:r>
+            <w:proofErr w:type="spellStart"/>
+            <w:r>
+              <w:rPr>
+                <w:rFonts w:ascii="Calibri" w:hAnsi="Calibri" w:cs="Calibri"/>
+                <w:color w:val="000000"/>
+                <w:sz w:val="20"/>
+                <w:szCs w:val="20"/>
+              </w:rPr>
+              <w:t>textoAVReguPECO</w:t>
+            </w:r>
+            <w:proofErr w:type="spellEnd"/>
+            <w:r>
+              <w:rPr>
+                <w:rFonts w:ascii="Calibri" w:hAnsi="Calibri" w:cs="Calibri"/>
+                <w:color w:val="000000"/>
+                <w:sz w:val="20"/>
+                <w:szCs w:val="20"/>
+              </w:rPr>
+              <w:t>}</w:t>
+            </w:r>
+          </w:p>
+        </w:tc>
+      </w:tr>
+      <w:tr>
+        <w:trPr>
+          <w:trHeight w:val="232"/>
+        </w:trPr>
+        <w:tc>
+          <w:tcPr>
+            <w:tcW w:w="1748" w:type="dxa"/>
+            <w:vAlign w:val="center"/>
+          </w:tcPr>
+          <w:p>
+            <w:pPr>
+              <w:jc w:val="both"/>
+              <w:rPr>
+                <w:rFonts w:ascii="Arial" w:eastAsia="Times New Roman" w:hAnsi="Arial" w:cs="Arial"/>
+                <w:color w:val="000000"/>
+                <w:sz w:val="20"/>
+                <w:szCs w:val="20"/>
+                <w:lang w:val="es-ES" w:eastAsia="es-ES"/>
+              </w:rPr>
+            </w:pPr>
+            <w:r>
+              <w:rPr>
+                <w:rFonts w:ascii="Arial" w:hAnsi="Arial" w:cs="Arial"/>
+                <w:sz w:val="20"/>
+                <w:szCs w:val="20"/>
+              </w:rPr>
+              <w:t>I.P.M.</w:t>
+            </w:r>
+          </w:p>
+        </w:tc>
+        <w:tc>
+          <w:tcPr>
+            <w:tcW w:w="2154" w:type="dxa"/>
+            <w:vAlign w:val="center"/>
+          </w:tcPr>
+          <w:p>
+            <w:pPr>
+              <w:jc w:val="right"/>
+              <w:rPr>
+                <w:rFonts w:ascii="Arial" w:eastAsia="Times New Roman" w:hAnsi="Arial" w:cs="Arial"/>
+                <w:color w:val="000000"/>
+                <w:sz w:val="20"/>
+                <w:szCs w:val="20"/>
+                <w:lang w:val="es-ES" w:eastAsia="es-ES"/>
+              </w:rPr>
+            </w:pPr>
+            <w:r>
+              <w:rPr>
+                <w:rFonts w:ascii="Calibri" w:hAnsi="Calibri" w:cs="Calibri"/>
+                <w:color w:val="000000"/>
+                <w:sz w:val="20"/>
+                <w:szCs w:val="20"/>
+              </w:rPr>
+              <w:t>{</w:t>
+            </w:r>
+            <w:proofErr w:type="spellStart"/>
+            <w:r>
+              <w:rPr>
+                <w:rFonts w:ascii="Calibri" w:hAnsi="Calibri" w:cs="Calibri"/>
+                <w:color w:val="000000"/>
+                <w:sz w:val="20"/>
+                <w:szCs w:val="20"/>
+              </w:rPr>
+              <w:t>textoIPMLiqu</w:t>
+            </w:r>
+            <w:proofErr w:type="spellEnd"/>
+            <w:r>
+              <w:rPr>
+                <w:rFonts w:ascii="Calibri" w:hAnsi="Calibri" w:cs="Calibri"/>
+                <w:color w:val="000000"/>
+                <w:sz w:val="20"/>
+                <w:szCs w:val="20"/>
+              </w:rPr>
+              <w:t>}</w:t>
+            </w:r>
+          </w:p>
+        </w:tc>
+        <w:tc>
+          <w:tcPr>
+            <w:tcW w:w="2154" w:type="dxa"/>
+            <w:vAlign w:val="center"/>
+          </w:tcPr>
+          <w:p>
+            <w:pPr>
+              <w:jc w:val="right"/>
+              <w:rPr>
+                <w:rFonts w:ascii="Calibri" w:hAnsi="Calibri" w:cs="Calibri"/>
+                <w:color w:val="000000"/>
+                <w:sz w:val="20"/>
+                <w:szCs w:val="20"/>
+              </w:rPr>
+            </w:pPr>
+            <w:r>
+              <w:rPr>
+                <w:rFonts w:ascii="Calibri" w:hAnsi="Calibri" w:cs="Calibri"/>
+                <w:color w:val="000000"/>
+                <w:sz w:val="20"/>
+                <w:szCs w:val="20"/>
+              </w:rPr>
+              <w:t>{</w:t>
+            </w:r>
+            <w:proofErr w:type="spellStart"/>
+            <w:r>
+              <w:rPr>
+                <w:rFonts w:ascii="Calibri" w:hAnsi="Calibri" w:cs="Calibri"/>
+                <w:color w:val="000000"/>
+                <w:sz w:val="20"/>
+                <w:szCs w:val="20"/>
+              </w:rPr>
+              <w:t>textoIPMNoReg</w:t>
+            </w:r>
+            <w:proofErr w:type="spellEnd"/>
+            <w:r>
+              <w:rPr>
+                <w:rFonts w:ascii="Calibri" w:hAnsi="Calibri" w:cs="Calibri"/>
+                <w:color w:val="000000"/>
+                <w:sz w:val="20"/>
+                <w:szCs w:val="20"/>
+              </w:rPr>
+              <w:t>}</w:t>
+            </w:r>
+          </w:p>
+        </w:tc>
+        <w:tc>
+          <w:tcPr>
+            <w:tcW w:w="2154" w:type="dxa"/>
+            <w:vAlign w:val="center"/>
+          </w:tcPr>
+          <w:p>
+            <w:pPr>
+              <w:jc w:val="right"/>
+              <w:rPr>
+                <w:rFonts w:ascii="Calibri" w:eastAsia="Times New Roman" w:hAnsi="Calibri" w:cs="Calibri"/>
+                <w:sz w:val="20"/>
+                <w:szCs w:val="20"/>
+                <w:lang w:val="en-US" w:eastAsia="es-ES"/>
+              </w:rPr>
+            </w:pPr>
+            <w:r>
+              <w:rPr>
+                <w:rFonts w:ascii="Calibri" w:eastAsia="Times New Roman" w:hAnsi="Calibri" w:cs="Calibri"/>
+                <w:sz w:val="20"/>
+                <w:szCs w:val="20"/>
+                <w:lang w:val="en-US" w:eastAsia="es-ES"/>
+              </w:rPr>
+              <w:t>{</w:t>
+            </w:r>
+            <w:proofErr w:type="spellStart"/>
+            <w:r>
+              <w:rPr>
+                <w:rFonts w:ascii="Calibri" w:eastAsia="Times New Roman" w:hAnsi="Calibri" w:cs="Calibri"/>
+                <w:sz w:val="20"/>
+                <w:szCs w:val="20"/>
+                <w:lang w:val="en-US" w:eastAsia="es-ES"/>
+              </w:rPr>
+              <w:t>textoIPMReguPECO</w:t>
+            </w:r>
+            <w:proofErr w:type="spellEnd"/>
+            <w:r>
+              <w:rPr>
+                <w:rFonts w:ascii="Calibri" w:eastAsia="Times New Roman" w:hAnsi="Calibri" w:cs="Calibri"/>
+                <w:sz w:val="20"/>
+                <w:szCs w:val="20"/>
+                <w:lang w:val="en-US" w:eastAsia="es-ES"/>
+              </w:rPr>
+              <w:t>}</w:t>
+            </w:r>
+          </w:p>
+        </w:tc>
+      </w:tr>
+      <w:tr>
+        <w:trPr>
+          <w:trHeight w:val="232"/>
+        </w:trPr>
+        <w:tc>
+          <w:tcPr>
+            <w:tcW w:w="1748" w:type="dxa"/>
+            <w:vAlign w:val="center"/>
+          </w:tcPr>
+          <w:p>
+            <w:pPr>
+              <w:jc w:val="both"/>
+              <w:rPr>
+                <w:rFonts w:ascii="Arial" w:eastAsia="Times New Roman" w:hAnsi="Arial" w:cs="Arial"/>
+                <w:color w:val="000000"/>
+                <w:sz w:val="20"/>
+                <w:szCs w:val="20"/>
+                <w:lang w:val="es-ES" w:eastAsia="es-ES"/>
+              </w:rPr>
+            </w:pPr>
+            <w:r>
+              <w:rPr>
+                <w:rFonts w:ascii="Arial" w:hAnsi="Arial" w:cs="Arial"/>
+                <w:sz w:val="20"/>
+                <w:szCs w:val="20"/>
+              </w:rPr>
+              <w:t>I.G.V.</w:t>
+            </w:r>
+          </w:p>
+        </w:tc>
+        <w:tc>
+          <w:tcPr>
+            <w:tcW w:w="2154" w:type="dxa"/>
+            <w:vAlign w:val="center"/>
+          </w:tcPr>
+          <w:p>
+            <w:pPr>
+              <w:jc w:val="right"/>
+              <w:rPr>
+                <w:rFonts w:ascii="Arial" w:eastAsia="Times New Roman" w:hAnsi="Arial" w:cs="Arial"/>
+                <w:color w:val="000000"/>
+                <w:sz w:val="20"/>
+                <w:szCs w:val="20"/>
+                <w:lang w:val="es-ES" w:eastAsia="es-ES"/>
+              </w:rPr>
+            </w:pPr>
+            <w:r>
+              <w:rPr>
+                <w:rFonts w:ascii="Calibri" w:hAnsi="Calibri" w:cs="Calibri"/>
+                <w:color w:val="000000"/>
+                <w:sz w:val="20"/>
+                <w:szCs w:val="20"/>
+              </w:rPr>
+              <w:t>{</w:t>
+            </w:r>
+            <w:proofErr w:type="spellStart"/>
+            <w:r>
+              <w:rPr>
+                <w:rFonts w:ascii="Calibri" w:hAnsi="Calibri" w:cs="Calibri"/>
+                <w:color w:val="000000"/>
+                <w:sz w:val="20"/>
+                <w:szCs w:val="20"/>
+              </w:rPr>
+              <w:t>textoIGVLiqu</w:t>
+            </w:r>
+            <w:proofErr w:type="spellEnd"/>
+            <w:r>
+              <w:rPr>
+                <w:rFonts w:ascii="Calibri" w:hAnsi="Calibri" w:cs="Calibri"/>
+                <w:color w:val="000000"/>
+                <w:sz w:val="20"/>
+                <w:szCs w:val="20"/>
+              </w:rPr>
+              <w:t>}</w:t>
+            </w:r>
+          </w:p>
+        </w:tc>
+        <w:tc>
+          <w:tcPr>
+            <w:tcW w:w="2154" w:type="dxa"/>
+            <w:vAlign w:val="center"/>
+          </w:tcPr>
+          <w:p>
+            <w:pPr>
+              <w:jc w:val="right"/>
+              <w:rPr>
+                <w:rFonts w:ascii="Calibri" w:hAnsi="Calibri" w:cs="Calibri"/>
+                <w:color w:val="000000"/>
+                <w:sz w:val="20"/>
+                <w:szCs w:val="20"/>
+              </w:rPr>
+            </w:pPr>
+            <w:r>
+              <w:rPr>
+                <w:rFonts w:ascii="Calibri" w:hAnsi="Calibri" w:cs="Calibri"/>
+                <w:color w:val="000000"/>
+                <w:sz w:val="20"/>
+                <w:szCs w:val="20"/>
+              </w:rPr>
+              <w:t>{</w:t>
+            </w:r>
+            <w:proofErr w:type="spellStart"/>
+            <w:r>
+              <w:rPr>
+                <w:rFonts w:ascii="Calibri" w:hAnsi="Calibri" w:cs="Calibri"/>
+                <w:color w:val="000000"/>
+                <w:sz w:val="20"/>
+                <w:szCs w:val="20"/>
+              </w:rPr>
+              <w:t>textoIGVNoReg</w:t>
+            </w:r>
+            <w:proofErr w:type="spellEnd"/>
+            <w:r>
+              <w:rPr>
+                <w:rFonts w:ascii="Calibri" w:hAnsi="Calibri" w:cs="Calibri"/>
+                <w:color w:val="000000"/>
+                <w:sz w:val="20"/>
+                <w:szCs w:val="20"/>
+              </w:rPr>
+              <w:t>}</w:t>
+            </w:r>
+          </w:p>
+        </w:tc>
+        <w:tc>
+          <w:tcPr>
+            <w:tcW w:w="2154" w:type="dxa"/>
+            <w:vAlign w:val="center"/>
+          </w:tcPr>
+          <w:p>
+            <w:pPr>
+              <w:jc w:val="right"/>
+              <w:rPr>
+                <w:rFonts w:ascii="Calibri" w:hAnsi="Calibri" w:cs="Calibri"/>
+                <w:color w:val="000000"/>
+                <w:sz w:val="20"/>
+                <w:szCs w:val="20"/>
+              </w:rPr>
+            </w:pPr>
+            <w:r>
+              <w:rPr>
+                <w:rFonts w:ascii="Calibri" w:hAnsi="Calibri" w:cs="Calibri"/>
+                <w:color w:val="000000"/>
+                <w:sz w:val="20"/>
+                <w:szCs w:val="20"/>
+              </w:rPr>
+              <w:t>{</w:t>
+            </w:r>
+            <w:proofErr w:type="spellStart"/>
+            <w:r>
+              <w:rPr>
+                <w:rFonts w:ascii="Calibri" w:hAnsi="Calibri" w:cs="Calibri"/>
+                <w:color w:val="000000"/>
+                <w:sz w:val="20"/>
+                <w:szCs w:val="20"/>
+              </w:rPr>
+              <w:t>textoIGVReguPECO</w:t>
+            </w:r>
+            <w:proofErr w:type="spellEnd"/>
+            <w:r>
+              <w:rPr>
+                <w:rFonts w:ascii="Calibri" w:hAnsi="Calibri" w:cs="Calibri"/>
+                <w:color w:val="000000"/>
+                <w:sz w:val="20"/>
+                <w:szCs w:val="20"/>
+              </w:rPr>
+              <w:t>}</w:t>
+            </w:r>
+          </w:p>
+        </w:tc>
+      </w:tr>
+      <w:tr>
+        <w:trPr>
+          <w:trHeight w:val="340"/>
+        </w:trPr>
+        <w:tc>
+          <w:tcPr>
+            <w:tcW w:w="1748" w:type="dxa"/>
+            <w:shd w:val="clear" w:color="auto" w:fill="D1D1D1" w:themeFill="background2" w:themeFillShade="E6"/>
+            <w:vAlign w:val="center"/>
+          </w:tcPr>
+          <w:p>
+            <w:pPr>
+              <w:rPr>
+                <w:rFonts w:ascii="Arial" w:eastAsia="Times New Roman" w:hAnsi="Arial" w:cs="Arial"/>
+                <w:color w:val="000000"/>
+                <w:sz w:val="20"/>
+                <w:szCs w:val="20"/>
+                <w:lang w:val="es-ES" w:eastAsia="es-ES"/>
+              </w:rPr>
+            </w:pPr>
+            <w:r>
+              <w:rPr>
+                <w:rFonts w:ascii="Arial" w:eastAsia="Times New Roman" w:hAnsi="Arial" w:cs="Arial"/>
+                <w:color w:val="000000"/>
+                <w:sz w:val="20"/>
+                <w:szCs w:val="20"/>
+                <w:lang w:val="es-ES" w:eastAsia="es-ES"/>
+              </w:rPr>
+              <w:t>TOTALES   S/</w:t>
+            </w:r>
+          </w:p>
+        </w:tc>
+        <w:tc>
+          <w:tcPr>
+            <w:tcW w:w="2154" w:type="dxa"/>
+            <w:shd w:val="clear" w:color="auto" w:fill="D1D1D1" w:themeFill="background2" w:themeFillShade="E6"/>
+            <w:vAlign w:val="center"/>
+          </w:tcPr>
+          <w:p>
+            <w:pPr>
+              <w:jc w:val="right"/>
+              <w:rPr>
+                <w:rFonts w:ascii="Arial" w:eastAsia="Times New Roman" w:hAnsi="Arial" w:cs="Arial"/>
+                <w:color w:val="000000"/>
+                <w:sz w:val="20"/>
+                <w:szCs w:val="20"/>
+                <w:lang w:val="es-ES" w:eastAsia="es-ES"/>
+              </w:rPr>
+            </w:pPr>
+            <w:r>
+              <w:rPr>
+                <w:rFonts w:ascii="Arial" w:eastAsia="Times New Roman" w:hAnsi="Arial" w:cs="Arial"/>
+                <w:color w:val="000000"/>
+                <w:sz w:val="20"/>
+                <w:szCs w:val="20"/>
+                <w:lang w:val="es-ES" w:eastAsia="es-ES"/>
+              </w:rPr>
+              <w:t>{</w:t>
+            </w:r>
+            <w:proofErr w:type="spellStart"/>
+            <w:r>
+              <w:rPr>
+                <w:rFonts w:ascii="Arial" w:eastAsia="Times New Roman" w:hAnsi="Arial" w:cs="Arial"/>
+                <w:color w:val="000000"/>
+                <w:sz w:val="20"/>
+                <w:szCs w:val="20"/>
+                <w:lang w:val="es-ES" w:eastAsia="es-ES"/>
+              </w:rPr>
+              <w:t>textoTotLiqu</w:t>
+            </w:r>
+            <w:proofErr w:type="spellEnd"/>
+            <w:r>
+              <w:rPr>
+                <w:rFonts w:ascii="Arial" w:eastAsia="Times New Roman" w:hAnsi="Arial" w:cs="Arial"/>
+                <w:color w:val="000000"/>
+                <w:sz w:val="20"/>
+                <w:szCs w:val="20"/>
+                <w:lang w:val="es-ES" w:eastAsia="es-ES"/>
+              </w:rPr>
+              <w:t>}</w:t>
+            </w:r>
+          </w:p>
+        </w:tc>
+        <w:tc>
+          <w:tcPr>
+            <w:tcW w:w="2154" w:type="dxa"/>
+            <w:shd w:val="clear" w:color="auto" w:fill="D1D1D1" w:themeFill="background2" w:themeFillShade="E6"/>
+            <w:vAlign w:val="center"/>
+          </w:tcPr>
+          <w:p>
+            <w:pPr>
+              <w:jc w:val="right"/>
+              <w:rPr>
+                <w:rFonts w:ascii="Arial" w:eastAsia="Times New Roman" w:hAnsi="Arial" w:cs="Arial"/>
+                <w:color w:val="000000"/>
+                <w:sz w:val="20"/>
+                <w:szCs w:val="20"/>
+                <w:lang w:val="es-ES" w:eastAsia="es-ES"/>
+              </w:rPr>
+            </w:pPr>
+            <w:r>
+              <w:rPr>
+                <w:rFonts w:ascii="Arial" w:eastAsia="Times New Roman" w:hAnsi="Arial" w:cs="Arial"/>
+                <w:color w:val="000000"/>
+                <w:sz w:val="20"/>
+                <w:szCs w:val="20"/>
+                <w:lang w:val="es-ES" w:eastAsia="es-ES"/>
+              </w:rPr>
+              <w:t>{</w:t>
+            </w:r>
+            <w:proofErr w:type="spellStart"/>
+            <w:r>
+              <w:rPr>
+                <w:rFonts w:ascii="Arial" w:eastAsia="Times New Roman" w:hAnsi="Arial" w:cs="Arial"/>
+                <w:color w:val="000000"/>
+                <w:sz w:val="20"/>
+                <w:szCs w:val="20"/>
+                <w:lang w:val="es-ES" w:eastAsia="es-ES"/>
+              </w:rPr>
+              <w:t>textoTotNoReg</w:t>
+            </w:r>
+            <w:proofErr w:type="spellEnd"/>
+            <w:r>
+              <w:rPr>
+                <w:rFonts w:ascii="Arial" w:eastAsia="Times New Roman" w:hAnsi="Arial" w:cs="Arial"/>
+                <w:color w:val="000000"/>
+                <w:sz w:val="20"/>
+                <w:szCs w:val="20"/>
+                <w:lang w:val="es-ES" w:eastAsia="es-ES"/>
+              </w:rPr>
+              <w:t>}</w:t>
+            </w:r>
+          </w:p>
+        </w:tc>
+        <w:tc>
+          <w:tcPr>
+            <w:tcW w:w="2154" w:type="dxa"/>
+            <w:shd w:val="clear" w:color="auto" w:fill="D1D1D1" w:themeFill="background2" w:themeFillShade="E6"/>
+            <w:vAlign w:val="center"/>
+          </w:tcPr>
+          <w:p>
+            <w:pPr>
+              <w:jc w:val="right"/>
+              <w:rPr>
+                <w:rFonts w:ascii="Arial" w:eastAsia="Times New Roman" w:hAnsi="Arial" w:cs="Arial"/>
+                <w:color w:val="000000"/>
+                <w:sz w:val="20"/>
+                <w:szCs w:val="20"/>
+                <w:lang w:val="es-ES" w:eastAsia="es-ES"/>
+              </w:rPr>
+            </w:pPr>
+            <w:r>
+              <w:rPr>
+                <w:rFonts w:ascii="Arial" w:eastAsia="Times New Roman" w:hAnsi="Arial" w:cs="Arial"/>
+                <w:color w:val="000000"/>
+                <w:sz w:val="20"/>
+                <w:szCs w:val="20"/>
+                <w:lang w:val="es-ES" w:eastAsia="es-ES"/>
+              </w:rPr>
+              <w:t>{</w:t>
+            </w:r>
+            <w:proofErr w:type="spellStart"/>
+            <w:r>
+              <w:rPr>
+                <w:rFonts w:ascii="Arial" w:eastAsia="Times New Roman" w:hAnsi="Arial" w:cs="Arial"/>
+                <w:color w:val="000000"/>
+                <w:sz w:val="20"/>
+                <w:szCs w:val="20"/>
+                <w:lang w:val="es-ES" w:eastAsia="es-ES"/>
+              </w:rPr>
+              <w:t>textoTotReguPECO</w:t>
+            </w:r>
+            <w:proofErr w:type="spellEnd"/>
+            <w:r>
+              <w:rPr>
+                <w:rFonts w:ascii="Arial" w:eastAsia="Times New Roman" w:hAnsi="Arial" w:cs="Arial"/>
+                <w:color w:val="000000"/>
+                <w:sz w:val="20"/>
+                <w:szCs w:val="20"/>
+                <w:lang w:val="es-ES" w:eastAsia="es-ES"/>
+              </w:rPr>
+              <w:t>}</w:t>
+            </w:r>
+          </w:p>
+        </w:tc>
+      </w:tr>
+    </w:tbl>
+    <w:p>
+      <w:pPr>
+        <w:pStyle w:val="Textoindependiente"/>
+        <w:spacing w:line="240" w:lineRule="auto"/>
+        <w:jc w:val="both"/>
+        <w:rPr>
+          <w:rFonts w:ascii="Arial" w:hAnsi="Arial" w:cs="Arial"/>
+          <w:sz w:val="20"/>
+          <w:szCs w:val="20"/>
+        </w:rPr>
+      </w:pPr>
+    </w:p>
+    <w:p>
+      <w:pPr>
+        <w:pStyle w:val="Textoindependiente"/>
+        <w:spacing w:line="240" w:lineRule="auto"/>
+        <w:jc w:val="both"/>
+        <w:rPr>
+          <w:rFonts w:ascii="Arial" w:hAnsi="Arial" w:cs="Arial"/>
+          <w:sz w:val="20"/>
+          <w:szCs w:val="20"/>
+        </w:rPr>
+      </w:pPr>
+      <w:r>
+        <w:rPr>
+          <w:rFonts w:ascii="Arial" w:hAnsi="Arial" w:cs="Arial"/>
+          <w:sz w:val="20"/>
+          <w:szCs w:val="20"/>
+        </w:rPr>
+        <w:t>{/</w:t>
+      </w:r>
+      <w:proofErr w:type="spellStart"/>
+      <w:r>
+        <w:rPr>
+          <w:rFonts w:ascii="Arial" w:hAnsi="Arial" w:cs="Arial"/>
+          <w:sz w:val="20"/>
+          <w:szCs w:val="20"/>
+        </w:rPr>
+        <w:t>estadoOnlyPECO</w:t>
+      </w:r>
       <w:proofErr w:type="spellEnd"/>
       <w:r>
         <w:rPr>
@@ -8316,7 +10225,6 @@
           <w:rFonts w:ascii="Arial" w:hAnsi="Arial" w:cs="Arial"/>
           <w:color w:val="000000" w:themeColor="text1"/>
         </w:rPr>
-        <w:lastRenderedPageBreak/>
         <w:t>identificado con RUC n.º</w:t>
       </w:r>
       <w:r>
@@ -8653,7 +10561,7 @@
           <w:rFonts w:ascii="Arial" w:hAnsi="Arial" w:cs="Arial"/>
           <w:color w:val="000000" w:themeColor="text1"/>
         </w:rPr>
-        <w:t>, se establece que la mercancía materia de regularización ha sido objeto de reconocimiento físico dentro del plazo previsto en el artículo 2º de la Resolución Ministerial n.º107-94-EF/10; por lo tanto, corresponde atender las series de la referida DAM solicitadas a regularización toda vez que se encuentran negociadas en el Arancel Común del Convenio Peruano - Colombiano con una tasa Ad/Valorem – Libre; asimismo, se debe tener en cuenta lo opinado en el informe n.º 50-2008-SUNAT/2B4000, ratificado mediante Informe n.º 11-2017-SUNAT/340000, donde dice que: “la devolución de los tributos pagados a cuenta, como regularización del despacho de mercancía acogidas estrictamente a los beneficios arancelarios otorgados por el PECO, comprende únicamente los derechos Ad/Valorem cancelados de las mercancías liberadas total o parcialmente por acogimiento del PECO; determinándose que el monto a regularizar en el marco del Decreto Supremo n.º 015 -94 - EF es de S/ {</w:t>
+        <w:t>, se establece que la mercancía materia de regularización ha sido objeto de reconocimiento físico dentro del plazo previsto en el artículo 2º de la Resolución Ministerial n.º107-94-EF/10; por lo tanto, corresponde atender las series de la referida DAM solicitadas a regularización toda vez que se encuentran negociadas en el Arancel Común del Convenio Peruano - Colombiano con una tasa Ad/Valorem – Libre; asimismo, se debe tener en cuenta lo opinado en el informe n.º 50-2008-SUNAT/2B4000, ratificado mediante Informe n.º 11-2017-SUNAT/340000, donde dice que: “la devolución de los tributos pagados a cuenta, como regularización del despacho de mercancía acogidas estrictamente a los beneficios arancelarios otorgados por el PECO, comprende únicamente los derechos Ad/Valorem cancelados de las mercancías liberadas total o parcialmente por acogimiento del PECO; determinándose que el monto a regularizar en el marco del Decreto Supremo n.º 015-94-EF es de S/ {</w:t>
       </w:r>
       <w:proofErr w:type="spellStart"/>
       <w:r>
@@ -8727,36 +10635,250 @@
       </w:r>
     </w:p>
     <w:p>
-      <w:pPr>
-        <w:rPr>
-          <w:rFonts w:ascii="Arial" w:hAnsi="Arial" w:cs="Arial"/>
-          <w:sz w:val="22"/>
-          <w:szCs w:val="22"/>
-        </w:rPr>
-      </w:pPr>
-      <w:r>
-        <w:rPr>
-          <w:rFonts w:ascii="Arial" w:hAnsi="Arial" w:cs="Arial"/>
-          <w:sz w:val="22"/>
-          <w:szCs w:val="22"/>
-        </w:rPr>
+      <w:r>
         <w:t>{#</w:t>
       </w:r>
       <w:r>
-        <w:rPr>
-          <w:rFonts w:ascii="Arial" w:hAnsi="Arial" w:cs="Arial"/>
-          <w:sz w:val="22"/>
-          <w:szCs w:val="22"/>
-        </w:rPr>
-        <w:t>estadopagoFacturaTipoVencimiento</w:t>
-      </w:r>
-      <w:r>
-        <w:rPr>
-          <w:rFonts w:ascii="Arial" w:hAnsi="Arial" w:cs="Arial"/>
-          <w:sz w:val="22"/>
-          <w:szCs w:val="22"/>
-        </w:rPr>
+        <w:t>estadoOnlyPECO</w:t>
+      </w:r>
+      <w:r>
         <w:t>}</w:t>
+      </w:r>
+    </w:p>
+    <w:p>
+      <w:pPr>
+        <w:ind w:left="284"/>
+        <w:jc w:val="both"/>
+        <w:rPr>
+          <w:rFonts w:ascii="Arial" w:hAnsi="Arial" w:cs="Arial"/>
+          <w:color w:val="000000" w:themeColor="text1"/>
+          <w:sz w:val="22"/>
+          <w:szCs w:val="22"/>
+        </w:rPr>
+      </w:pPr>
+      <w:r>
+        <w:rPr>
+          <w:rFonts w:ascii="Arial" w:hAnsi="Arial" w:cs="Arial"/>
+          <w:color w:val="000000" w:themeColor="text1"/>
+          <w:sz w:val="22"/>
+          <w:szCs w:val="22"/>
+        </w:rPr>
+        <w:t>De acuerdo a la solicitud de regularización/reconocimiento físico n.º {cuadroPedoAmazonia-numeroRegularizacion}</w:t>
+      </w:r>
+      <w:r>
+        <w:rPr>
+          <w:rFonts w:ascii="Arial" w:hAnsi="Arial" w:cs="Arial"/>
+          <w:color w:val="FF0000"/>
+          <w:sz w:val="22"/>
+          <w:szCs w:val="22"/>
+        </w:rPr>
+        <w:t>{cuadroPedoAmazonia-numeroRegularizacionRRR}</w:t>
+      </w:r>
+      <w:r>
+        <w:rPr>
+          <w:rFonts w:ascii="Arial" w:hAnsi="Arial" w:cs="Arial"/>
+          <w:color w:val="000000" w:themeColor="text1"/>
+          <w:sz w:val="22"/>
+          <w:szCs w:val="22"/>
+        </w:rPr>
+        <w:t xml:space="preserve"> del {cuadroPedoAmazonia-fechaRegularizacion}</w:t>
+      </w:r>
+      <w:r>
+        <w:rPr>
+          <w:rFonts w:ascii="Arial" w:hAnsi="Arial" w:cs="Arial"/>
+          <w:color w:val="FF0000"/>
+          <w:sz w:val="22"/>
+          <w:szCs w:val="22"/>
+        </w:rPr>
+        <w:t>{cuadroPedoAmazonia-fechaRegularizacionRRR}</w:t>
+      </w:r>
+      <w:r>
+        <w:rPr>
+          <w:rFonts w:ascii="Arial" w:hAnsi="Arial" w:cs="Arial"/>
+          <w:color w:val="000000" w:themeColor="text1"/>
+          <w:sz w:val="22"/>
+          <w:szCs w:val="22"/>
+        </w:rPr>
+        <w:t>, presentado por {</w:t>
+      </w:r>
+      <w:proofErr w:type="spellStart"/>
+      <w:r>
+        <w:rPr>
+          <w:rFonts w:ascii="Arial" w:hAnsi="Arial" w:cs="Arial"/>
+          <w:color w:val="000000" w:themeColor="text1"/>
+          <w:sz w:val="22"/>
+          <w:szCs w:val="22"/>
+        </w:rPr>
+        <w:t>fromDam-nombreEmpresa</w:t>
+      </w:r>
+      <w:proofErr w:type="spellEnd"/>
+      <w:r>
+        <w:rPr>
+          <w:rFonts w:ascii="Arial" w:hAnsi="Arial" w:cs="Arial"/>
+          <w:color w:val="000000" w:themeColor="text1"/>
+          <w:sz w:val="22"/>
+          <w:szCs w:val="22"/>
+        </w:rPr>
+        <w:t>}</w:t>
+      </w:r>
+      <w:r>
+        <w:rPr>
+          <w:rFonts w:ascii="Arial" w:hAnsi="Arial" w:cs="Arial"/>
+          <w:color w:val="FF0000"/>
+          <w:sz w:val="22"/>
+          <w:szCs w:val="22"/>
+        </w:rPr>
+        <w:t>{</w:t>
+      </w:r>
+      <w:proofErr w:type="spellStart"/>
+      <w:r>
+        <w:rPr>
+          <w:rFonts w:ascii="Arial" w:hAnsi="Arial" w:cs="Arial"/>
+          <w:color w:val="FF0000"/>
+          <w:sz w:val="22"/>
+          <w:szCs w:val="22"/>
+        </w:rPr>
+        <w:t>fromDam-nombreEmpresaRRR</w:t>
+      </w:r>
+      <w:proofErr w:type="spellEnd"/>
+      <w:r>
+        <w:rPr>
+          <w:rFonts w:ascii="Arial" w:hAnsi="Arial" w:cs="Arial"/>
+          <w:color w:val="FF0000"/>
+          <w:sz w:val="22"/>
+          <w:szCs w:val="22"/>
+        </w:rPr>
+        <w:t>}</w:t>
+      </w:r>
+      <w:r>
+        <w:rPr>
+          <w:rFonts w:ascii="Arial" w:hAnsi="Arial" w:cs="Arial"/>
+          <w:color w:val="000000" w:themeColor="text1"/>
+          <w:sz w:val="22"/>
+          <w:szCs w:val="22"/>
+        </w:rPr>
+        <w:t>, identificado con RUC n.º {</w:t>
+      </w:r>
+      <w:proofErr w:type="spellStart"/>
+      <w:r>
+        <w:rPr>
+          <w:rFonts w:ascii="Arial" w:hAnsi="Arial" w:cs="Arial"/>
+          <w:color w:val="000000" w:themeColor="text1"/>
+          <w:sz w:val="22"/>
+          <w:szCs w:val="22"/>
+        </w:rPr>
+        <w:t>fromDam</w:t>
+      </w:r>
+      <w:proofErr w:type="spellEnd"/>
+      <w:r>
+        <w:rPr>
+          <w:rFonts w:ascii="Arial" w:hAnsi="Arial" w:cs="Arial"/>
+          <w:color w:val="000000" w:themeColor="text1"/>
+          <w:sz w:val="22"/>
+          <w:szCs w:val="22"/>
+        </w:rPr>
+        <w:t>-ruc}</w:t>
+      </w:r>
+      <w:r>
+        <w:rPr>
+          <w:rFonts w:ascii="Arial" w:hAnsi="Arial" w:cs="Arial"/>
+          <w:color w:val="FF0000"/>
+          <w:sz w:val="22"/>
+          <w:szCs w:val="22"/>
+        </w:rPr>
+        <w:t>{</w:t>
+      </w:r>
+      <w:proofErr w:type="spellStart"/>
+      <w:r>
+        <w:rPr>
+          <w:rFonts w:ascii="Arial" w:hAnsi="Arial" w:cs="Arial"/>
+          <w:color w:val="FF0000"/>
+          <w:sz w:val="22"/>
+          <w:szCs w:val="22"/>
+        </w:rPr>
+        <w:t>fromDam-rucRRR</w:t>
+      </w:r>
+      <w:proofErr w:type="spellEnd"/>
+      <w:r>
+        <w:rPr>
+          <w:rFonts w:ascii="Arial" w:hAnsi="Arial" w:cs="Arial"/>
+          <w:color w:val="FF0000"/>
+          <w:sz w:val="22"/>
+          <w:szCs w:val="22"/>
+        </w:rPr>
+        <w:t>}</w:t>
+      </w:r>
+      <w:r>
+        <w:rPr>
+          <w:rFonts w:ascii="Arial" w:hAnsi="Arial" w:cs="Arial"/>
+          <w:color w:val="000000" w:themeColor="text1"/>
+          <w:sz w:val="22"/>
+          <w:szCs w:val="22"/>
+        </w:rPr>
+        <w:t>, se establece que la mercancía materia de regularización ha sido objeto de reconocimiento físico dentro del plazo previsto en el artículo 2º de la Resolución Ministerial n.º107-94-EF/10; por lo tanto, corresponde atender las series de la referida DAM solicitadas a regularización toda vez que se encuentran negociadas en el Arancel Común del Convenio Peruano - Colombiano con una tasa Ad/Valorem – Libre; asimismo, se debe tener en cuenta lo opinado en el informe n.º 50-2008-SUNAT/2B4000, ratificado mediante Informe n.º 11-2017-SUNAT/340000, donde dice que: “la devolución de los tributos pagados a cuenta, como regularización del despacho de mercancía acogidas estrictamente a los beneficios arancelarios otorgados por el PECO, comprende únicamente los derechos Ad/Valorem cancelados de las mercancías liberadas total o parcialmente por acogimiento del PECO; determinándose que el monto a regularizar en el marco del Decreto Supremo n.º 015-94-EF es de S/ {</w:t>
+      </w:r>
+      <w:proofErr w:type="spellStart"/>
+      <w:r>
+        <w:rPr>
+          <w:rFonts w:ascii="Arial" w:hAnsi="Arial" w:cs="Arial"/>
+          <w:color w:val="000000" w:themeColor="text1"/>
+          <w:sz w:val="22"/>
+          <w:szCs w:val="22"/>
+        </w:rPr>
+        <w:t>textoTotReguPECO</w:t>
+      </w:r>
+      <w:proofErr w:type="spellEnd"/>
+      <w:r>
+        <w:rPr>
+          <w:rFonts w:ascii="Arial" w:hAnsi="Arial" w:cs="Arial"/>
+          <w:color w:val="000000" w:themeColor="text1"/>
+          <w:sz w:val="22"/>
+          <w:szCs w:val="22"/>
+        </w:rPr>
+        <w:t>}</w:t>
+      </w:r>
+    </w:p>
+    <w:p>
+      <w:pPr>
+        <w:ind w:left="284"/>
+        <w:jc w:val="both"/>
+        <w:rPr>
+          <w:rFonts w:ascii="Arial" w:hAnsi="Arial" w:cs="Arial"/>
+          <w:color w:val="000000" w:themeColor="text1"/>
+          <w:sz w:val="22"/>
+          <w:szCs w:val="22"/>
+        </w:rPr>
+      </w:pPr>
+    </w:p>
+    <w:p>
+      <w:r>
+        <w:t>{/</w:t>
+      </w:r>
+      <w:proofErr w:type="spellStart"/>
+      <w:r>
+        <w:t>estadoOnlyPECO</w:t>
+      </w:r>
+      <w:proofErr w:type="spellEnd"/>
+      <w:r>
+        <w:t>}</w:t>
+      </w:r>
+    </w:p>
+    <w:p>
+      <w:pPr>
+        <w:rPr>
+          <w:rFonts w:ascii="Arial" w:hAnsi="Arial" w:cs="Arial"/>
+          <w:sz w:val="22"/>
+          <w:szCs w:val="22"/>
+        </w:rPr>
+      </w:pPr>
+      <w:r>
+        <w:rPr>
+          <w:rFonts w:ascii="Arial" w:hAnsi="Arial" w:cs="Arial"/>
+          <w:sz w:val="22"/>
+          <w:szCs w:val="22"/>
+        </w:rPr>
+        <w:lastRenderedPageBreak/>
+        <w:t>{#estadopagoFacturaTipoVencimiento}</w:t>
       </w:r>
     </w:p>
     <w:p>
@@ -8863,7 +10985,7 @@
         </w:rPr>
         <w:t xml:space="preserve">El importador a través </w:t>
       </w:r>
-      <w:bookmarkStart w:id="10" w:name="_Hlk231251977"/>
+      <w:bookmarkStart w:id="11" w:name="_Hlk231251977"/>
       <w:r>
         <w:rPr>
           <w:rFonts w:ascii="Arial" w:hAnsi="Arial"/>
@@ -9041,15 +11163,7 @@
           <w:sz w:val="22"/>
           <w:szCs w:val="22"/>
         </w:rPr>
-        <w:t>fechaVencimiento</w:t>
-      </w:r>
-      <w:r>
-        <w:rPr>
-          <w:rFonts w:ascii="Arial" w:hAnsi="Arial"/>
-          <w:sz w:val="22"/>
-          <w:szCs w:val="22"/>
-        </w:rPr>
-        <w:t>}</w:t>
+        <w:t>fechaVencimiento}</w:t>
       </w:r>
       <w:r>
         <w:rPr>
@@ -9123,30 +11237,56 @@
           <w:sz w:val="22"/>
           <w:szCs w:val="22"/>
         </w:rPr>
-        <w:t xml:space="preserve">se evidencia que el importador todavía se encuentra dentro del plazo para realizar la transferencia por el pago de las mercancías; en tal sentido, corresponde </w:t>
-      </w:r>
+        <w:t>se evidencia que el importador todavía se encuentra dentro del plazo para realizar la transferencia por el pago de las mercancías; en tal sentido, corresponde la devolución solicitada por {</w:t>
+      </w:r>
+      <w:proofErr w:type="spellStart"/>
       <w:r>
         <w:rPr>
           <w:rFonts w:ascii="Arial" w:hAnsi="Arial"/>
           <w:sz w:val="22"/>
           <w:szCs w:val="22"/>
         </w:rPr>
-        <w:lastRenderedPageBreak/>
-        <w:t>la devolución solicitada por {</w:t>
+        <w:t>fromDam-nombreEmpresa</w:t>
+      </w:r>
+      <w:proofErr w:type="spellEnd"/>
+      <w:r>
+        <w:rPr>
+          <w:rFonts w:ascii="Arial" w:hAnsi="Arial"/>
+          <w:sz w:val="22"/>
+          <w:szCs w:val="22"/>
+        </w:rPr>
+        <w:t>}</w:t>
+      </w:r>
+      <w:r>
+        <w:rPr>
+          <w:rFonts w:ascii="Arial" w:hAnsi="Arial"/>
+          <w:b/>
+          <w:bCs/>
+          <w:color w:val="FF0000"/>
+          <w:sz w:val="22"/>
+          <w:szCs w:val="22"/>
+        </w:rPr>
+        <w:t>{</w:t>
       </w:r>
       <w:proofErr w:type="spellStart"/>
       <w:r>
         <w:rPr>
           <w:rFonts w:ascii="Arial" w:hAnsi="Arial"/>
-          <w:sz w:val="22"/>
-          <w:szCs w:val="22"/>
-        </w:rPr>
-        <w:t>fromDam-nombreEmpresa</w:t>
+          <w:b/>
+          <w:bCs/>
+          <w:color w:val="FF0000"/>
+          <w:sz w:val="22"/>
+          <w:szCs w:val="22"/>
+        </w:rPr>
+        <w:t>fromDam-nombreEmpresaRRR</w:t>
       </w:r>
       <w:proofErr w:type="spellEnd"/>
       <w:r>
         <w:rPr>
           <w:rFonts w:ascii="Arial" w:hAnsi="Arial"/>
+          <w:b/>
+          <w:bCs/>
+          <w:color w:val="FF0000"/>
           <w:sz w:val="22"/>
           <w:szCs w:val="22"/>
         </w:rPr>
@@ -9155,65 +11295,30 @@
       <w:r>
         <w:rPr>
           <w:rFonts w:ascii="Arial" w:hAnsi="Arial"/>
-          <w:b/>
-          <w:bCs/>
-          <w:color w:val="FF0000"/>
-          <w:sz w:val="22"/>
-          <w:szCs w:val="22"/>
-        </w:rPr>
-        <w:t>{</w:t>
+          <w:sz w:val="22"/>
+          <w:szCs w:val="22"/>
+        </w:rPr>
+        <w:t>. identificada con RUC n.º {</w:t>
       </w:r>
       <w:proofErr w:type="spellStart"/>
       <w:r>
         <w:rPr>
           <w:rFonts w:ascii="Arial" w:hAnsi="Arial"/>
-          <w:b/>
-          <w:bCs/>
-          <w:color w:val="FF0000"/>
-          <w:sz w:val="22"/>
-          <w:szCs w:val="22"/>
-        </w:rPr>
-        <w:t>fromDam-nombreEmpresaRRR</w:t>
+          <w:sz w:val="22"/>
+          <w:szCs w:val="22"/>
+        </w:rPr>
+        <w:t>fromDam</w:t>
       </w:r>
       <w:proofErr w:type="spellEnd"/>
       <w:r>
         <w:rPr>
           <w:rFonts w:ascii="Arial" w:hAnsi="Arial"/>
-          <w:b/>
-          <w:bCs/>
-          <w:color w:val="FF0000"/>
-          <w:sz w:val="22"/>
-          <w:szCs w:val="22"/>
-        </w:rPr>
-        <w:t>}</w:t>
-      </w:r>
-      <w:r>
-        <w:rPr>
-          <w:rFonts w:ascii="Arial" w:hAnsi="Arial"/>
-          <w:sz w:val="22"/>
-          <w:szCs w:val="22"/>
-        </w:rPr>
-        <w:t>. identificada con RUC n.º {</w:t>
-      </w:r>
-      <w:proofErr w:type="spellStart"/>
-      <w:r>
-        <w:rPr>
-          <w:rFonts w:ascii="Arial" w:hAnsi="Arial"/>
-          <w:sz w:val="22"/>
-          <w:szCs w:val="22"/>
-        </w:rPr>
-        <w:t>fromDam</w:t>
-      </w:r>
-      <w:proofErr w:type="spellEnd"/>
-      <w:r>
-        <w:rPr>
-          <w:rFonts w:ascii="Arial" w:hAnsi="Arial"/>
           <w:sz w:val="22"/>
           <w:szCs w:val="22"/>
         </w:rPr>
         <w:t>-ruc} al amparo de la Ley n.º 27037, al no configurar la exclusión establecida en el artículo 8° de la Mencionada Ley</w:t>
       </w:r>
-      <w:bookmarkEnd w:id="10"/>
+      <w:bookmarkEnd w:id="11"/>
       <w:r>
         <w:rPr>
           <w:rFonts w:ascii="Arial" w:hAnsi="Arial"/>
@@ -9250,7 +11355,7 @@
         </w:rPr>
         <w:t>{/</w:t>
       </w:r>
-      <w:bookmarkStart w:id="11" w:name="_Hlk231251945"/>
+      <w:bookmarkStart w:id="12" w:name="_Hlk231251945"/>
       <w:proofErr w:type="spellStart"/>
       <w:r>
         <w:rPr>
@@ -9260,7 +11365,7 @@
         </w:rPr>
         <w:t>estadopagoFacturaTipoVencimiento</w:t>
       </w:r>
-      <w:bookmarkEnd w:id="11"/>
+      <w:bookmarkEnd w:id="12"/>
       <w:proofErr w:type="spellEnd"/>
       <w:r>
         <w:rPr>
@@ -9286,14 +11391,14 @@
         </w:rPr>
         <w:t>{#</w:t>
       </w:r>
-      <w:bookmarkStart w:id="12" w:name="_Hlk231251936"/>
+      <w:bookmarkStart w:id="13" w:name="_Hlk231251936"/>
       <w:r>
         <w:rPr>
           <w:rFonts w:ascii="Arial" w:hAnsi="Arial" w:cs="Arial"/>
         </w:rPr>
         <w:t>estadoPagoFacturaTipoPlazo</w:t>
       </w:r>
-      <w:bookmarkEnd w:id="12"/>
+      <w:bookmarkEnd w:id="13"/>
       <w:r>
         <w:rPr>
           <w:rFonts w:ascii="Arial" w:hAnsi="Arial" w:cs="Arial"/>
@@ -9405,7 +11510,7 @@
         </w:rPr>
         <w:t xml:space="preserve">El importador a </w:t>
       </w:r>
-      <w:bookmarkStart w:id="13" w:name="_Hlk231251994"/>
+      <w:bookmarkStart w:id="14" w:name="_Hlk231251994"/>
       <w:r>
         <w:rPr>
           <w:rFonts w:ascii="Arial" w:hAnsi="Arial"/>
@@ -9779,7 +11884,7 @@
         </w:rPr>
         <w:t>-ruc} al amparo de la Ley n.º 27037, al no configurar la exclusión establecida en el artículo 8° de la Mencionada Ley</w:t>
       </w:r>
-      <w:bookmarkEnd w:id="13"/>
+      <w:bookmarkEnd w:id="14"/>
       <w:r>
         <w:rPr>
           <w:rFonts w:ascii="Arial" w:hAnsi="Arial"/>
@@ -9814,7 +11919,7 @@
         </w:rPr>
         <w:t>{/</w:t>
       </w:r>
-      <w:bookmarkStart w:id="14" w:name="_Hlk231251929"/>
+      <w:bookmarkStart w:id="15" w:name="_Hlk231251929"/>
       <w:proofErr w:type="spellStart"/>
       <w:r>
         <w:rPr>
@@ -9822,7 +11927,7 @@
         </w:rPr>
         <w:t>estadoPagoFacturaTipoPlazo</w:t>
       </w:r>
-      <w:bookmarkEnd w:id="14"/>
+      <w:bookmarkEnd w:id="15"/>
       <w:proofErr w:type="spellEnd"/>
       <w:r>
         <w:rPr>
@@ -9846,14 +11951,14 @@
         </w:rPr>
         <w:t>{#</w:t>
       </w:r>
-      <w:bookmarkStart w:id="15" w:name="_Hlk231251916"/>
+      <w:bookmarkStart w:id="16" w:name="_Hlk231251916"/>
       <w:r>
         <w:rPr>
           <w:rFonts w:ascii="Arial" w:hAnsi="Arial" w:cs="Arial"/>
         </w:rPr>
         <w:t>estadoPago</w:t>
       </w:r>
-      <w:bookmarkEnd w:id="15"/>
+      <w:bookmarkEnd w:id="16"/>
       <w:r>
         <w:rPr>
           <w:rFonts w:ascii="Arial" w:hAnsi="Arial" w:cs="Arial"/>
@@ -9875,6 +11980,7 @@
         <w:rPr>
           <w:rFonts w:ascii="Arial" w:hAnsi="Arial" w:cs="Arial"/>
         </w:rPr>
+        <w:lastRenderedPageBreak/>
         <w:t xml:space="preserve">La </w:t>
       </w:r>
       <w:r>
@@ -9929,7 +12035,7 @@
         </w:rPr>
         <w:t>{/</w:t>
       </w:r>
-      <w:bookmarkStart w:id="16" w:name="_Hlk231251910"/>
+      <w:bookmarkStart w:id="17" w:name="_Hlk231251910"/>
       <w:proofErr w:type="spellStart"/>
       <w:r>
         <w:rPr>
@@ -9939,7 +12045,7 @@
         </w:rPr>
         <w:t>estadoPago</w:t>
       </w:r>
-      <w:bookmarkEnd w:id="16"/>
+      <w:bookmarkEnd w:id="17"/>
       <w:proofErr w:type="spellEnd"/>
       <w:r>
         <w:rPr>
@@ -9969,7 +12075,7 @@
           <w:szCs w:val="22"/>
         </w:rPr>
       </w:pPr>
-      <w:bookmarkStart w:id="17" w:name="_Hlk58837397"/>
+      <w:bookmarkStart w:id="18" w:name="_Hlk58837397"/>
       <w:r>
         <w:rPr>
           <w:rFonts w:ascii="Arial" w:hAnsi="Arial" w:cs="Arial"/>
@@ -10192,7 +12298,7 @@
         </w:rPr>
         <w:t>} en el marco de la de la Ley n.º 27037</w:t>
       </w:r>
-      <w:bookmarkEnd w:id="17"/>
+      <w:bookmarkEnd w:id="18"/>
       <w:r>
         <w:rPr>
           <w:rFonts w:ascii="Arial" w:hAnsi="Arial" w:cs="Arial"/>
@@ -10282,16 +12388,7 @@
           <w:sz w:val="22"/>
           <w:szCs w:val="22"/>
         </w:rPr>
-        <w:t xml:space="preserve">, a </w:t>
-      </w:r>
-      <w:r>
-        <w:rPr>
-          <w:rFonts w:ascii="Arial" w:hAnsi="Arial"/>
-          <w:sz w:val="22"/>
-          <w:szCs w:val="22"/>
-        </w:rPr>
-        <w:lastRenderedPageBreak/>
-        <w:t>favor de</w:t>
+        <w:t>, a favor de</w:t>
       </w:r>
       <w:r>
         <w:rPr>
@@ -10848,6 +12945,444 @@
         </w:rPr>
         <w:t>}</w:t>
       </w:r>
+    </w:p>
+    <w:p>
+      <w:pPr>
+        <w:spacing w:after="0" w:line="240" w:lineRule="auto"/>
+        <w:jc w:val="both"/>
+        <w:rPr>
+          <w:rFonts w:ascii="Arial" w:hAnsi="Arial" w:cs="Arial"/>
+          <w:sz w:val="22"/>
+          <w:szCs w:val="22"/>
+        </w:rPr>
+      </w:pPr>
+      <w:r>
+        <w:rPr>
+          <w:rFonts w:ascii="Arial" w:hAnsi="Arial" w:cs="Arial"/>
+          <w:sz w:val="22"/>
+          <w:szCs w:val="22"/>
+        </w:rPr>
+        <w:t>{#</w:t>
+      </w:r>
+      <w:r>
+        <w:rPr>
+          <w:rFonts w:ascii="Arial" w:hAnsi="Arial" w:cs="Arial"/>
+          <w:sz w:val="22"/>
+          <w:szCs w:val="22"/>
+        </w:rPr>
+        <w:t>estadoPECOyAMAZONIA</w:t>
+      </w:r>
+      <w:r>
+        <w:rPr>
+          <w:rFonts w:ascii="Arial" w:hAnsi="Arial" w:cs="Arial"/>
+          <w:sz w:val="22"/>
+          <w:szCs w:val="22"/>
+        </w:rPr>
+        <w:t>Proc}</w:t>
+      </w:r>
+    </w:p>
+    <w:p>
+      <w:pPr>
+        <w:pStyle w:val="Prrafodelista"/>
+        <w:numPr>
+          <w:ilvl w:val="0"/>
+          <w:numId w:val="20"/>
+        </w:numPr>
+        <w:spacing w:after="0" w:line="240" w:lineRule="auto"/>
+        <w:ind w:left="426"/>
+        <w:jc w:val="both"/>
+        <w:rPr>
+          <w:rFonts w:ascii="Arial" w:hAnsi="Arial" w:cs="Arial"/>
+          <w:sz w:val="22"/>
+          <w:szCs w:val="22"/>
+        </w:rPr>
+      </w:pPr>
+      <w:r>
+        <w:rPr>
+          <w:rFonts w:ascii="Arial" w:hAnsi="Arial" w:cs="Arial"/>
+          <w:sz w:val="22"/>
+          <w:szCs w:val="22"/>
+        </w:rPr>
+        <w:lastRenderedPageBreak/>
+        <w:t xml:space="preserve">Declarar procedente la regularización de la regularización de la DAM </w:t>
+      </w:r>
+      <w:proofErr w:type="spellStart"/>
+      <w:r>
+        <w:rPr>
+          <w:rFonts w:ascii="Arial" w:hAnsi="Arial" w:cs="Arial"/>
+          <w:sz w:val="22"/>
+          <w:szCs w:val="22"/>
+        </w:rPr>
+        <w:t>n.°</w:t>
+      </w:r>
+      <w:proofErr w:type="spellEnd"/>
+      <w:r>
+        <w:rPr>
+          <w:rFonts w:ascii="Arial" w:hAnsi="Arial" w:cs="Arial"/>
+          <w:sz w:val="22"/>
+          <w:szCs w:val="22"/>
+        </w:rPr>
+        <w:t xml:space="preserve"> {</w:t>
+      </w:r>
+      <w:proofErr w:type="spellStart"/>
+      <w:r>
+        <w:rPr>
+          <w:rFonts w:ascii="Arial" w:hAnsi="Arial" w:cs="Arial"/>
+          <w:sz w:val="22"/>
+          <w:szCs w:val="22"/>
+        </w:rPr>
+        <w:t>fromDam-numeroDam</w:t>
+      </w:r>
+      <w:proofErr w:type="spellEnd"/>
+      <w:r>
+        <w:rPr>
+          <w:rFonts w:ascii="Arial" w:hAnsi="Arial" w:cs="Arial"/>
+          <w:sz w:val="22"/>
+          <w:szCs w:val="22"/>
+        </w:rPr>
+        <w:t>} en el marco del Decreto Supremo n.º 015-94-EF y la Ley n.º 27037 Ley de Promoción de la Inversión en la Amazonía y normas conexas</w:t>
+      </w:r>
+      <w:r>
+        <w:rPr>
+          <w:rFonts w:ascii="Arial" w:hAnsi="Arial" w:cs="Arial"/>
+          <w:iCs/>
+          <w:sz w:val="22"/>
+          <w:szCs w:val="22"/>
+        </w:rPr>
+        <w:t>.</w:t>
+      </w:r>
+    </w:p>
+    <w:p>
+      <w:pPr>
+        <w:spacing w:after="0" w:line="240" w:lineRule="auto"/>
+        <w:ind w:left="426"/>
+        <w:jc w:val="both"/>
+        <w:rPr>
+          <w:rFonts w:ascii="Arial" w:hAnsi="Arial" w:cs="Arial"/>
+          <w:sz w:val="22"/>
+          <w:szCs w:val="22"/>
+        </w:rPr>
+      </w:pPr>
+    </w:p>
+    <w:p>
+      <w:pPr>
+        <w:pStyle w:val="Prrafodelista"/>
+        <w:numPr>
+          <w:ilvl w:val="0"/>
+          <w:numId w:val="20"/>
+        </w:numPr>
+        <w:spacing w:after="0" w:line="240" w:lineRule="auto"/>
+        <w:ind w:left="426"/>
+        <w:jc w:val="both"/>
+        <w:rPr>
+          <w:rFonts w:ascii="Arial" w:hAnsi="Arial" w:cs="Arial"/>
+          <w:sz w:val="22"/>
+          <w:szCs w:val="22"/>
+        </w:rPr>
+      </w:pPr>
+      <w:r>
+        <w:rPr>
+          <w:rFonts w:ascii="Arial" w:hAnsi="Arial" w:cs="Arial"/>
+          <w:sz w:val="22"/>
+          <w:szCs w:val="22"/>
+        </w:rPr>
+        <w:t>Autorizar la devolución por el importe de S/ {</w:t>
+      </w:r>
+      <w:proofErr w:type="spellStart"/>
+      <w:r>
+        <w:rPr>
+          <w:rFonts w:ascii="Arial" w:hAnsi="Arial" w:cs="Arial"/>
+          <w:sz w:val="22"/>
+          <w:szCs w:val="22"/>
+        </w:rPr>
+        <w:t>textoTotReguPECO</w:t>
+      </w:r>
+      <w:proofErr w:type="spellEnd"/>
+      <w:r>
+        <w:rPr>
+          <w:rFonts w:ascii="Arial" w:hAnsi="Arial" w:cs="Arial"/>
+          <w:sz w:val="22"/>
+          <w:szCs w:val="22"/>
+        </w:rPr>
+        <w:t>} con cargo a la “Sub - Cuenta Especial Tesoro Público Decreto Supremo n. º 015-94-EF” y por el importe de S/ {textoTotRegu27} en el marco de la Ley n.º 27037 Ley de Promoción de la Inversión en la Amazonía y normas conexas, a favor de {</w:t>
+      </w:r>
+      <w:proofErr w:type="spellStart"/>
+      <w:r>
+        <w:rPr>
+          <w:rFonts w:ascii="Arial" w:hAnsi="Arial" w:cs="Arial"/>
+          <w:sz w:val="22"/>
+          <w:szCs w:val="22"/>
+        </w:rPr>
+        <w:t>fromDam-nombreEmpresa</w:t>
+      </w:r>
+      <w:proofErr w:type="spellEnd"/>
+      <w:r>
+        <w:rPr>
+          <w:rFonts w:ascii="Arial" w:hAnsi="Arial" w:cs="Arial"/>
+          <w:sz w:val="22"/>
+          <w:szCs w:val="22"/>
+        </w:rPr>
+        <w:t>}, sin perjuicio de la fiscalización posterior que pudiera realizar la Superintendencia Nacional de Aduanas y de Administración Tributaria – SUNAT</w:t>
+      </w:r>
+      <w:r>
+        <w:rPr>
+          <w:rFonts w:ascii="Arial" w:hAnsi="Arial" w:cs="Arial"/>
+          <w:iCs/>
+          <w:sz w:val="22"/>
+          <w:szCs w:val="22"/>
+        </w:rPr>
+        <w:t>.</w:t>
+      </w:r>
+    </w:p>
+    <w:p>
+      <w:pPr>
+        <w:pStyle w:val="Prrafodelista"/>
+        <w:spacing w:after="0" w:line="240" w:lineRule="auto"/>
+        <w:ind w:left="360"/>
+        <w:jc w:val="both"/>
+        <w:rPr>
+          <w:rFonts w:ascii="Arial" w:hAnsi="Arial" w:cs="Arial"/>
+          <w:sz w:val="22"/>
+          <w:szCs w:val="22"/>
+        </w:rPr>
+      </w:pPr>
+    </w:p>
+    <w:p>
+      <w:pPr>
+        <w:spacing w:after="0" w:line="240" w:lineRule="auto"/>
+        <w:jc w:val="both"/>
+        <w:rPr>
+          <w:rFonts w:ascii="Arial" w:hAnsi="Arial" w:cs="Arial"/>
+          <w:sz w:val="14"/>
+          <w:szCs w:val="14"/>
+        </w:rPr>
+      </w:pPr>
+    </w:p>
+    <w:p>
+      <w:pPr>
+        <w:pStyle w:val="Textoindependiente"/>
+        <w:spacing w:after="0" w:line="240" w:lineRule="auto"/>
+        <w:jc w:val="both"/>
+        <w:rPr>
+          <w:rFonts w:ascii="Arial" w:hAnsi="Arial" w:cs="Arial"/>
+        </w:rPr>
+      </w:pPr>
+      <w:r>
+        <w:rPr>
+          <w:rFonts w:ascii="Arial" w:hAnsi="Arial" w:cs="Arial"/>
+        </w:rPr>
+        <w:t>{/</w:t>
+      </w:r>
+      <w:proofErr w:type="spellStart"/>
+      <w:r>
+        <w:rPr>
+          <w:rFonts w:ascii="Arial" w:hAnsi="Arial" w:cs="Arial"/>
+        </w:rPr>
+        <w:t>estadoPECOyAMAZONIA</w:t>
+      </w:r>
+      <w:r>
+        <w:rPr>
+          <w:rFonts w:ascii="Arial" w:hAnsi="Arial" w:cs="Arial"/>
+        </w:rPr>
+        <w:t>Proc</w:t>
+      </w:r>
+      <w:proofErr w:type="spellEnd"/>
+      <w:r>
+        <w:rPr>
+          <w:rFonts w:ascii="Arial" w:hAnsi="Arial" w:cs="Arial"/>
+        </w:rPr>
+        <w:t>}</w:t>
+      </w:r>
+    </w:p>
+    <w:p>
+      <w:pPr>
+        <w:pStyle w:val="Textoindependiente"/>
+        <w:spacing w:after="0" w:line="240" w:lineRule="auto"/>
+        <w:jc w:val="both"/>
+        <w:rPr>
+          <w:rFonts w:ascii="Arial" w:hAnsi="Arial" w:cs="Arial"/>
+        </w:rPr>
+      </w:pPr>
+      <w:r>
+        <w:rPr>
+          <w:rFonts w:ascii="Arial" w:hAnsi="Arial" w:cs="Arial"/>
+        </w:rPr>
+        <w:t>{#estadoOnlyPECO}</w:t>
+      </w:r>
+    </w:p>
+    <w:p>
+      <w:pPr>
+        <w:pStyle w:val="Prrafodelista"/>
+        <w:numPr>
+          <w:ilvl w:val="0"/>
+          <w:numId w:val="20"/>
+        </w:numPr>
+        <w:spacing w:after="0" w:line="240" w:lineRule="auto"/>
+        <w:ind w:left="426"/>
+        <w:jc w:val="both"/>
+        <w:rPr>
+          <w:rFonts w:ascii="Arial" w:hAnsi="Arial" w:cs="Arial"/>
+          <w:sz w:val="22"/>
+          <w:szCs w:val="22"/>
+        </w:rPr>
+      </w:pPr>
+      <w:r>
+        <w:rPr>
+          <w:rFonts w:ascii="Arial" w:hAnsi="Arial" w:cs="Arial"/>
+          <w:sz w:val="22"/>
+          <w:szCs w:val="22"/>
+        </w:rPr>
+        <w:t xml:space="preserve">Declarar procedente la regularización de la regularización de la DAM </w:t>
+      </w:r>
+      <w:proofErr w:type="spellStart"/>
+      <w:r>
+        <w:rPr>
+          <w:rFonts w:ascii="Arial" w:hAnsi="Arial" w:cs="Arial"/>
+          <w:sz w:val="22"/>
+          <w:szCs w:val="22"/>
+        </w:rPr>
+        <w:t>n.°</w:t>
+      </w:r>
+      <w:proofErr w:type="spellEnd"/>
+      <w:r>
+        <w:rPr>
+          <w:rFonts w:ascii="Arial" w:hAnsi="Arial" w:cs="Arial"/>
+          <w:sz w:val="22"/>
+          <w:szCs w:val="22"/>
+        </w:rPr>
+        <w:t xml:space="preserve"> {</w:t>
+      </w:r>
+      <w:proofErr w:type="spellStart"/>
+      <w:r>
+        <w:rPr>
+          <w:rFonts w:ascii="Arial" w:hAnsi="Arial" w:cs="Arial"/>
+          <w:sz w:val="22"/>
+          <w:szCs w:val="22"/>
+        </w:rPr>
+        <w:t>fromDam-numeroDam</w:t>
+      </w:r>
+      <w:proofErr w:type="spellEnd"/>
+      <w:r>
+        <w:rPr>
+          <w:rFonts w:ascii="Arial" w:hAnsi="Arial" w:cs="Arial"/>
+          <w:sz w:val="22"/>
+          <w:szCs w:val="22"/>
+        </w:rPr>
+        <w:t>} en el marco del Decreto Supremo n.º 015-94-EF y normas conexas.</w:t>
+      </w:r>
+    </w:p>
+    <w:p>
+      <w:pPr>
+        <w:pStyle w:val="Prrafodelista"/>
+        <w:spacing w:after="0" w:line="240" w:lineRule="auto"/>
+        <w:ind w:left="426"/>
+        <w:jc w:val="both"/>
+        <w:rPr>
+          <w:rFonts w:ascii="Arial" w:hAnsi="Arial" w:cs="Arial"/>
+          <w:sz w:val="22"/>
+          <w:szCs w:val="22"/>
+        </w:rPr>
+      </w:pPr>
+    </w:p>
+    <w:p>
+      <w:pPr>
+        <w:pStyle w:val="Prrafodelista"/>
+        <w:numPr>
+          <w:ilvl w:val="0"/>
+          <w:numId w:val="20"/>
+        </w:numPr>
+        <w:spacing w:after="0" w:line="240" w:lineRule="auto"/>
+        <w:ind w:left="426"/>
+        <w:jc w:val="both"/>
+        <w:rPr>
+          <w:rFonts w:ascii="Arial" w:hAnsi="Arial" w:cs="Arial"/>
+          <w:sz w:val="22"/>
+          <w:szCs w:val="22"/>
+        </w:rPr>
+      </w:pPr>
+      <w:r>
+        <w:rPr>
+          <w:rFonts w:ascii="Arial" w:hAnsi="Arial" w:cs="Arial"/>
+          <w:sz w:val="22"/>
+          <w:szCs w:val="22"/>
+        </w:rPr>
+        <w:t>Autorizar la devolución por el importe de S/ {textoTotRegu27} en el marco del Decreto Supremo n.º 015-94-EF y normas conexas, a favor de {</w:t>
+      </w:r>
+      <w:proofErr w:type="spellStart"/>
+      <w:r>
+        <w:rPr>
+          <w:rFonts w:ascii="Arial" w:hAnsi="Arial" w:cs="Arial"/>
+          <w:sz w:val="22"/>
+          <w:szCs w:val="22"/>
+        </w:rPr>
+        <w:t>fromDam-nombreEmpresa</w:t>
+      </w:r>
+      <w:proofErr w:type="spellEnd"/>
+      <w:r>
+        <w:rPr>
+          <w:rFonts w:ascii="Arial" w:hAnsi="Arial" w:cs="Arial"/>
+          <w:sz w:val="22"/>
+          <w:szCs w:val="22"/>
+        </w:rPr>
+        <w:t>}, sin perjuicio de la fiscalización posterior que pudiera realizar la Superintendencia Nacional de Aduanas y de Administración Tributaria – SUNAT.</w:t>
+      </w:r>
+    </w:p>
+    <w:p>
+      <w:pPr>
+        <w:pStyle w:val="Prrafodelista"/>
+        <w:rPr>
+          <w:rFonts w:ascii="Arial" w:hAnsi="Arial" w:cs="Arial"/>
+          <w:sz w:val="14"/>
+          <w:szCs w:val="14"/>
+        </w:rPr>
+      </w:pPr>
+    </w:p>
+    <w:p>
+      <w:pPr>
+        <w:spacing w:after="0" w:line="240" w:lineRule="auto"/>
+        <w:jc w:val="both"/>
+        <w:rPr>
+          <w:rFonts w:ascii="Arial" w:hAnsi="Arial" w:cs="Arial"/>
+          <w:sz w:val="22"/>
+          <w:szCs w:val="22"/>
+        </w:rPr>
+      </w:pPr>
+      <w:r>
+        <w:rPr>
+          <w:rFonts w:ascii="Arial" w:hAnsi="Arial" w:cs="Arial"/>
+          <w:sz w:val="22"/>
+          <w:szCs w:val="22"/>
+        </w:rPr>
+        <w:t>{/</w:t>
+      </w:r>
+      <w:proofErr w:type="spellStart"/>
+      <w:r>
+        <w:rPr>
+          <w:rFonts w:ascii="Arial" w:hAnsi="Arial" w:cs="Arial"/>
+          <w:sz w:val="22"/>
+          <w:szCs w:val="22"/>
+        </w:rPr>
+        <w:t>estadoOnlyPECO</w:t>
+      </w:r>
+      <w:proofErr w:type="spellEnd"/>
+      <w:r>
+        <w:rPr>
+          <w:rFonts w:ascii="Arial" w:hAnsi="Arial" w:cs="Arial"/>
+          <w:sz w:val="22"/>
+          <w:szCs w:val="22"/>
+        </w:rPr>
+        <w:t>}</w:t>
+      </w:r>
+    </w:p>
+    <w:p>
+      <w:pPr>
+        <w:pStyle w:val="Textoindependiente"/>
+        <w:spacing w:after="0" w:line="240" w:lineRule="auto"/>
+        <w:jc w:val="both"/>
+        <w:rPr>
+          <w:rFonts w:ascii="Arial" w:hAnsi="Arial" w:cs="Arial"/>
+        </w:rPr>
+      </w:pPr>
     </w:p>
     <w:p>
       <w:pPr>
@@ -11547,6 +14082,108 @@
     </w:lvl>
   </w:abstractNum>
   <w:abstractNum w:abstractNumId="6" w15:restartNumberingAfterBreak="0">
+    <w:nsid w:val="25317D54"/>
+    <w:multiLevelType w:val="multilevel"/>
+    <w:tmpl w:val="4586B06A"/>
+    <w:lvl w:ilvl="0">
+      <w:start w:val="1"/>
+      <w:numFmt w:val="upperRoman"/>
+      <w:lvlText w:val="%1."/>
+      <w:lvlJc w:val="left"/>
+      <w:pPr>
+        <w:ind w:left="1004" w:hanging="720"/>
+      </w:pPr>
+      <w:rPr>
+        <w:rFonts w:ascii="Arial" w:hAnsi="Arial" w:cs="Arial" w:hint="default"/>
+        <w:b/>
+        <w:sz w:val="22"/>
+        <w:szCs w:val="22"/>
+      </w:rPr>
+    </w:lvl>
+    <w:lvl w:ilvl="1">
+      <w:start w:val="1"/>
+      <w:numFmt w:val="bullet"/>
+      <w:lvlText w:val=""/>
+      <w:lvlJc w:val="left"/>
+      <w:pPr>
+        <w:ind w:left="1004" w:hanging="360"/>
+      </w:pPr>
+      <w:rPr>
+        <w:rFonts w:ascii="Symbol" w:hAnsi="Symbol" w:hint="default"/>
+      </w:rPr>
+    </w:lvl>
+    <w:lvl w:ilvl="2">
+      <w:start w:val="1"/>
+      <w:numFmt w:val="decimal"/>
+      <w:isLgl/>
+      <w:lvlText w:val="%1.%2.%3"/>
+      <w:lvlJc w:val="left"/>
+      <w:pPr>
+        <w:ind w:left="1364" w:hanging="720"/>
+      </w:pPr>
+    </w:lvl>
+    <w:lvl w:ilvl="3">
+      <w:start w:val="1"/>
+      <w:numFmt w:val="decimal"/>
+      <w:isLgl/>
+      <w:lvlText w:val="%1.%2.%3.%4"/>
+      <w:lvlJc w:val="left"/>
+      <w:pPr>
+        <w:ind w:left="1364" w:hanging="720"/>
+      </w:pPr>
+    </w:lvl>
+    <w:lvl w:ilvl="4">
+      <w:start w:val="1"/>
+      <w:numFmt w:val="decimal"/>
+      <w:isLgl/>
+      <w:lvlText w:val="%1.%2.%3.%4.%5"/>
+      <w:lvlJc w:val="left"/>
+      <w:pPr>
+        <w:ind w:left="1364" w:hanging="720"/>
+      </w:pPr>
+    </w:lvl>
+    <w:lvl w:ilvl="5">
+      <w:start w:val="1"/>
+      <w:numFmt w:val="decimal"/>
+      <w:isLgl/>
+      <w:lvlText w:val="%1.%2.%3.%4.%5.%6"/>
+      <w:lvlJc w:val="left"/>
+      <w:pPr>
+        <w:ind w:left="1724" w:hanging="1080"/>
+      </w:pPr>
+    </w:lvl>
+    <w:lvl w:ilvl="6">
+      <w:start w:val="1"/>
+      <w:numFmt w:val="decimal"/>
+      <w:isLgl/>
+      <w:lvlText w:val="%1.%2.%3.%4.%5.%6.%7"/>
+      <w:lvlJc w:val="left"/>
+      <w:pPr>
+        <w:ind w:left="1724" w:hanging="1080"/>
+      </w:pPr>
+    </w:lvl>
+    <w:lvl w:ilvl="7">
+      <w:start w:val="1"/>
+      <w:numFmt w:val="decimal"/>
+      <w:isLgl/>
+      <w:lvlText w:val="%1.%2.%3.%4.%5.%6.%7.%8"/>
+      <w:lvlJc w:val="left"/>
+      <w:pPr>
+        <w:ind w:left="2084" w:hanging="1440"/>
+      </w:pPr>
+    </w:lvl>
+    <w:lvl w:ilvl="8">
+      <w:start w:val="1"/>
+      <w:numFmt w:val="decimal"/>
+      <w:isLgl/>
+      <w:lvlText w:val="%1.%2.%3.%4.%5.%6.%7.%8.%9"/>
+      <w:lvlJc w:val="left"/>
+      <w:pPr>
+        <w:ind w:left="2084" w:hanging="1440"/>
+      </w:pPr>
+    </w:lvl>
+  </w:abstractNum>
+  <w:abstractNum w:abstractNumId="7" w15:restartNumberingAfterBreak="0">
     <w:nsid w:val="2C46431F"/>
     <w:multiLevelType w:val="hybridMultilevel"/>
     <w:tmpl w:val="5EF65E64"/>
@@ -11659,7 +14296,7 @@
       </w:rPr>
     </w:lvl>
   </w:abstractNum>
-  <w:abstractNum w:abstractNumId="7" w15:restartNumberingAfterBreak="0">
+  <w:abstractNum w:abstractNumId="8" w15:restartNumberingAfterBreak="0">
     <w:nsid w:val="2DBD610D"/>
     <w:multiLevelType w:val="multilevel"/>
     <w:tmpl w:val="1550F8C6"/>
@@ -11772,7 +14409,7 @@
       </w:pPr>
     </w:lvl>
   </w:abstractNum>
-  <w:abstractNum w:abstractNumId="8" w15:restartNumberingAfterBreak="0">
+  <w:abstractNum w:abstractNumId="9" w15:restartNumberingAfterBreak="0">
     <w:nsid w:val="365F2B40"/>
     <w:multiLevelType w:val="multilevel"/>
     <w:tmpl w:val="FCB2FF18"/>
@@ -11885,7 +14522,7 @@
       </w:pPr>
     </w:lvl>
   </w:abstractNum>
-  <w:abstractNum w:abstractNumId="9" w15:restartNumberingAfterBreak="0">
+  <w:abstractNum w:abstractNumId="10" w15:restartNumberingAfterBreak="0">
     <w:nsid w:val="39152369"/>
     <w:multiLevelType w:val="multilevel"/>
     <w:tmpl w:val="595205FE"/>
@@ -12007,7 +14644,7 @@
       </w:rPr>
     </w:lvl>
   </w:abstractNum>
-  <w:abstractNum w:abstractNumId="10" w15:restartNumberingAfterBreak="0">
+  <w:abstractNum w:abstractNumId="11" w15:restartNumberingAfterBreak="0">
     <w:nsid w:val="39292BD4"/>
     <w:multiLevelType w:val="multilevel"/>
     <w:tmpl w:val="20026EE6"/>
@@ -12129,7 +14766,7 @@
       </w:rPr>
     </w:lvl>
   </w:abstractNum>
-  <w:abstractNum w:abstractNumId="11" w15:restartNumberingAfterBreak="0">
+  <w:abstractNum w:abstractNumId="12" w15:restartNumberingAfterBreak="0">
     <w:nsid w:val="3A5B7C8C"/>
     <w:multiLevelType w:val="multilevel"/>
     <w:tmpl w:val="5C4E820E"/>
@@ -12236,7 +14873,7 @@
       </w:pPr>
     </w:lvl>
   </w:abstractNum>
-  <w:abstractNum w:abstractNumId="12" w15:restartNumberingAfterBreak="0">
+  <w:abstractNum w:abstractNumId="13" w15:restartNumberingAfterBreak="0">
     <w:nsid w:val="3E9509FA"/>
     <w:multiLevelType w:val="hybridMultilevel"/>
     <w:tmpl w:val="E050083E"/>
@@ -12322,7 +14959,7 @@
       </w:pPr>
     </w:lvl>
   </w:abstractNum>
-  <w:abstractNum w:abstractNumId="13" w15:restartNumberingAfterBreak="0">
+  <w:abstractNum w:abstractNumId="14" w15:restartNumberingAfterBreak="0">
     <w:nsid w:val="3EF20B13"/>
     <w:multiLevelType w:val="multilevel"/>
     <w:tmpl w:val="280A001D"/>
@@ -12408,7 +15045,7 @@
       </w:pPr>
     </w:lvl>
   </w:abstractNum>
-  <w:abstractNum w:abstractNumId="14" w15:restartNumberingAfterBreak="0">
+  <w:abstractNum w:abstractNumId="15" w15:restartNumberingAfterBreak="0">
     <w:nsid w:val="4A597263"/>
     <w:multiLevelType w:val="multilevel"/>
     <w:tmpl w:val="425411F2"/>
@@ -12521,7 +15158,7 @@
       </w:pPr>
     </w:lvl>
   </w:abstractNum>
-  <w:abstractNum w:abstractNumId="15" w15:restartNumberingAfterBreak="0">
+  <w:abstractNum w:abstractNumId="16" w15:restartNumberingAfterBreak="0">
     <w:nsid w:val="554178CF"/>
     <w:multiLevelType w:val="hybridMultilevel"/>
     <w:tmpl w:val="D6C2812E"/>
@@ -12610,7 +15247,7 @@
       </w:pPr>
     </w:lvl>
   </w:abstractNum>
-  <w:abstractNum w:abstractNumId="16" w15:restartNumberingAfterBreak="0">
+  <w:abstractNum w:abstractNumId="17" w15:restartNumberingAfterBreak="0">
     <w:nsid w:val="5F5F0475"/>
     <w:multiLevelType w:val="multilevel"/>
     <w:tmpl w:val="4EF8ED88"/>
@@ -12723,7 +15360,7 @@
       </w:pPr>
     </w:lvl>
   </w:abstractNum>
-  <w:abstractNum w:abstractNumId="17" w15:restartNumberingAfterBreak="0">
+  <w:abstractNum w:abstractNumId="18" w15:restartNumberingAfterBreak="0">
     <w:nsid w:val="618E4D0A"/>
     <w:multiLevelType w:val="hybridMultilevel"/>
     <w:tmpl w:val="95DEDF86"/>
@@ -12836,7 +15473,7 @@
       </w:rPr>
     </w:lvl>
   </w:abstractNum>
-  <w:abstractNum w:abstractNumId="18" w15:restartNumberingAfterBreak="0">
+  <w:abstractNum w:abstractNumId="19" w15:restartNumberingAfterBreak="0">
     <w:nsid w:val="6C4604A6"/>
     <w:multiLevelType w:val="multilevel"/>
     <w:tmpl w:val="1F9ABF4C"/>
@@ -12950,10 +15587,10 @@
     </w:lvl>
   </w:abstractNum>
   <w:num w:numId="1" w16cid:durableId="180559468">
-    <w:abstractNumId w:val="12"/>
+    <w:abstractNumId w:val="13"/>
   </w:num>
   <w:num w:numId="2" w16cid:durableId="1346126794">
-    <w:abstractNumId w:val="11"/>
+    <w:abstractNumId w:val="12"/>
     <w:lvlOverride w:ilvl="0">
       <w:startOverride w:val="1"/>
     </w:lvlOverride>
@@ -12983,25 +15620,25 @@
     </w:lvlOverride>
   </w:num>
   <w:num w:numId="3" w16cid:durableId="551423060">
-    <w:abstractNumId w:val="11"/>
+    <w:abstractNumId w:val="12"/>
   </w:num>
   <w:num w:numId="4" w16cid:durableId="250896805">
-    <w:abstractNumId w:val="13"/>
+    <w:abstractNumId w:val="14"/>
   </w:num>
   <w:num w:numId="5" w16cid:durableId="987438694">
     <w:abstractNumId w:val="1"/>
   </w:num>
   <w:num w:numId="6" w16cid:durableId="950086557">
-    <w:abstractNumId w:val="15"/>
+    <w:abstractNumId w:val="16"/>
   </w:num>
   <w:num w:numId="7" w16cid:durableId="1685546533">
+    <w:abstractNumId w:val="11"/>
+  </w:num>
+  <w:num w:numId="8" w16cid:durableId="338196847">
     <w:abstractNumId w:val="10"/>
   </w:num>
-  <w:num w:numId="8" w16cid:durableId="338196847">
-    <w:abstractNumId w:val="9"/>
-  </w:num>
   <w:num w:numId="9" w16cid:durableId="1011879487">
-    <w:abstractNumId w:val="18"/>
+    <w:abstractNumId w:val="19"/>
   </w:num>
   <w:num w:numId="10" w16cid:durableId="2057965523">
     <w:abstractNumId w:val="4"/>
@@ -13013,28 +15650,31 @@
     <w:abstractNumId w:val="5"/>
   </w:num>
   <w:num w:numId="13" w16cid:durableId="1960453710">
-    <w:abstractNumId w:val="14"/>
+    <w:abstractNumId w:val="15"/>
   </w:num>
   <w:num w:numId="14" w16cid:durableId="2130006636">
-    <w:abstractNumId w:val="16"/>
+    <w:abstractNumId w:val="17"/>
   </w:num>
   <w:num w:numId="15" w16cid:durableId="2041053610">
-    <w:abstractNumId w:val="8"/>
+    <w:abstractNumId w:val="9"/>
   </w:num>
   <w:num w:numId="16" w16cid:durableId="665474328">
-    <w:abstractNumId w:val="7"/>
+    <w:abstractNumId w:val="8"/>
   </w:num>
   <w:num w:numId="17" w16cid:durableId="990133682">
     <w:abstractNumId w:val="0"/>
   </w:num>
   <w:num w:numId="18" w16cid:durableId="1734542069">
-    <w:abstractNumId w:val="6"/>
+    <w:abstractNumId w:val="7"/>
   </w:num>
   <w:num w:numId="19" w16cid:durableId="1620990844">
-    <w:abstractNumId w:val="17"/>
+    <w:abstractNumId w:val="18"/>
   </w:num>
   <w:num w:numId="20" w16cid:durableId="1302491897">
     <w:abstractNumId w:val="2"/>
+  </w:num>
+  <w:num w:numId="21" w16cid:durableId="1334456930">
+    <w:abstractNumId w:val="6"/>
   </w:num>
 </w:numbering>
 </file>
@@ -13641,6 +16281,7 @@
   <w:style w:type="character" w:default="1" w:styleId="Fuentedeprrafopredeter">
     <w:name w:val="Default Paragraph Font"/>
     <w:uiPriority w:val="1"/>
+    <w:semiHidden/>
     <w:unhideWhenUsed/>
   </w:style>
   <w:style w:type="table" w:default="1" w:styleId="Tablanormal">

</xml_diff>

<commit_message>
se soluciono algun errores tipograficos
</commit_message>
<xml_diff>
--- a/interfaz3/semiPlantillaFinalInformeV2NUEVO.docx
+++ b/interfaz3/semiPlantillaFinalInformeV2NUEVO.docx
@@ -2953,7 +2953,23 @@
           <w:sz w:val="22"/>
           <w:szCs w:val="22"/>
         </w:rPr>
-        <w:t xml:space="preserve"> cancelan los tributos sujetos a regulación, correspondientes a la importación señalada en el considerando anterior, siendo abonado a la “Sub-Cuenta Especial Tesoro Público Ley </w:t>
+        <w:t xml:space="preserve"> cancelan los tributos sujetos a </w:t>
+      </w:r>
+      <w:r>
+        <w:rPr>
+          <w:rFonts w:ascii="Arial" w:hAnsi="Arial" w:cs="Arial"/>
+          <w:sz w:val="22"/>
+          <w:szCs w:val="22"/>
+        </w:rPr>
+        <w:t>regularización</w:t>
+      </w:r>
+      <w:r>
+        <w:rPr>
+          <w:rFonts w:ascii="Arial" w:hAnsi="Arial" w:cs="Arial"/>
+          <w:sz w:val="22"/>
+          <w:szCs w:val="22"/>
+        </w:rPr>
+        <w:t xml:space="preserve">, correspondientes a la importación señalada en el considerando anterior, siendo abonado a la “Sub-Cuenta Especial Tesoro Público Ley </w:t>
       </w:r>
       <w:r>
         <w:rPr>
@@ -3198,7 +3214,23 @@
           <w:sz w:val="22"/>
           <w:szCs w:val="22"/>
         </w:rPr>
-        <w:t xml:space="preserve"> cancelan los tributos sujetos a regulación, correspondientes a la importación señalada en el considerando anterior, siendo abonado</w:t>
+        <w:t xml:space="preserve"> cancelan los tributos sujetos a </w:t>
+      </w:r>
+      <w:r>
+        <w:rPr>
+          <w:rFonts w:ascii="Arial" w:hAnsi="Arial" w:cs="Arial"/>
+          <w:sz w:val="22"/>
+          <w:szCs w:val="22"/>
+        </w:rPr>
+        <w:t>regularización</w:t>
+      </w:r>
+      <w:r>
+        <w:rPr>
+          <w:rFonts w:ascii="Arial" w:hAnsi="Arial" w:cs="Arial"/>
+          <w:sz w:val="22"/>
+          <w:szCs w:val="22"/>
+        </w:rPr>
+        <w:t>, correspondientes a la importación señalada en el considerando anterior, siendo abonado</w:t>
       </w:r>
       <w:r>
         <w:rPr>
@@ -3492,7 +3524,23 @@
           <w:sz w:val="22"/>
           <w:szCs w:val="22"/>
         </w:rPr>
-        <w:t xml:space="preserve"> cancelan los tributos sujetos a regulación, correspondientes a la importación señalada en el considerando anterior, siendo abonados a la “Sub-Cuenta Especial Tesoro Público – D.S. n.º 015-94-EF” el importe de S/ {</w:t>
+        <w:t xml:space="preserve"> cancelan los tributos sujetos a </w:t>
+      </w:r>
+      <w:r>
+        <w:rPr>
+          <w:rFonts w:ascii="Arial" w:hAnsi="Arial" w:cs="Arial"/>
+          <w:sz w:val="22"/>
+          <w:szCs w:val="22"/>
+        </w:rPr>
+        <w:t>regularización</w:t>
+      </w:r>
+      <w:r>
+        <w:rPr>
+          <w:rFonts w:ascii="Arial" w:hAnsi="Arial" w:cs="Arial"/>
+          <w:sz w:val="22"/>
+          <w:szCs w:val="22"/>
+        </w:rPr>
+        <w:t>, correspondientes a la importación señalada en el considerando anterior, siendo abonados a la “Sub-Cuenta Especial Tesoro Público – D.S. n.º 015-94-EF” el importe de S/ {</w:t>
       </w:r>
       <w:proofErr w:type="spellStart"/>
       <w:r>
@@ -12256,7 +12304,7 @@
           <w:sz w:val="22"/>
           <w:szCs w:val="22"/>
         </w:rPr>
-        <w:t xml:space="preserve">Declarar procedente la regularización de la regularización de la DAM </w:t>
+        <w:t xml:space="preserve">Declarar procedente la regularización de la DAM </w:t>
       </w:r>
       <w:proofErr w:type="spellStart"/>
       <w:r>
@@ -12549,7 +12597,7 @@
         <w:rPr>
           <w:rFonts w:ascii="Arial" w:hAnsi="Arial" w:cs="Arial"/>
         </w:rPr>
-        <w:t xml:space="preserve">procedente la regularización de la regularización de la DAM </w:t>
+        <w:t xml:space="preserve">procedente la regularización de la DAM </w:t>
       </w:r>
       <w:proofErr w:type="spellStart"/>
       <w:r>
@@ -12752,7 +12800,7 @@
           <w:sz w:val="22"/>
           <w:szCs w:val="22"/>
         </w:rPr>
-        <w:t xml:space="preserve">procedente la regularización de la regularización de la DAM </w:t>
+        <w:t xml:space="preserve">procedente la regularización de la DAM </w:t>
       </w:r>
       <w:proofErr w:type="spellStart"/>
       <w:r>
@@ -12981,7 +13029,23 @@
           <w:szCs w:val="22"/>
         </w:rPr>
         <w:lastRenderedPageBreak/>
-        <w:t xml:space="preserve">Declarar procedente la regularización de la regularización de la DAM </w:t>
+        <w:t>Declarar procedente la regularización</w:t>
+      </w:r>
+      <w:r>
+        <w:rPr>
+          <w:rFonts w:ascii="Arial" w:hAnsi="Arial" w:cs="Arial"/>
+          <w:sz w:val="22"/>
+          <w:szCs w:val="22"/>
+        </w:rPr>
+        <w:t xml:space="preserve"> </w:t>
+      </w:r>
+      <w:r>
+        <w:rPr>
+          <w:rFonts w:ascii="Arial" w:hAnsi="Arial" w:cs="Arial"/>
+          <w:sz w:val="22"/>
+          <w:szCs w:val="22"/>
+        </w:rPr>
+        <w:t xml:space="preserve">de la DAM </w:t>
       </w:r>
       <w:proofErr w:type="spellStart"/>
       <w:r>

</xml_diff>